<commit_message>
Update Microfrontend App HLD.docx remove outdated content
</commit_message>
<xml_diff>
--- a/Microfrontend App HLD.docx
+++ b/Microfrontend App HLD.docx
@@ -217,15 +217,7 @@
       <w:pPr>
         <w:rPr>
           <w:rFonts w:ascii="Calibri" w:hAnsi="Calibri" w:cs="Calibri"/>
-        </w:rPr>
-      </w:pPr>
-    </w:p>
-    <w:p>
-      <w:pPr>
-        <w:rPr>
-          <w:rFonts w:ascii="Calibri" w:hAnsi="Calibri" w:cs="Calibri"/>
-          <w:sz w:val="36"/>
-          <w:szCs w:val="36"/>
+          <w:lang w:val="en-IN"/>
         </w:rPr>
       </w:pPr>
       <w:hyperlink r:id="rId5" w:history="1">
@@ -233,22 +225,10 @@
           <w:rPr>
             <w:rStyle w:val="Hyperlink"/>
             <w:rFonts w:ascii="Calibri" w:hAnsi="Calibri" w:cs="Calibri"/>
-            <w:sz w:val="36"/>
-            <w:szCs w:val="36"/>
+            <w:lang w:val="en-IN"/>
           </w:rPr>
-          <w:t>GitHub - pankajexpressian/</w:t>
+          <w:t>https://github.com/gargaekansh/nagp_client_side_architecture_insurance_app-</w:t>
         </w:r>
-        <w:proofErr w:type="spellStart"/>
-        <w:r>
-          <w:rPr>
-            <w:rStyle w:val="Hyperlink"/>
-            <w:rFonts w:ascii="Calibri" w:hAnsi="Calibri" w:cs="Calibri"/>
-            <w:sz w:val="36"/>
-            <w:szCs w:val="36"/>
-          </w:rPr>
-          <w:t>nagp_client_side_architecture</w:t>
-        </w:r>
-        <w:proofErr w:type="spellEnd"/>
       </w:hyperlink>
     </w:p>
     <w:p>
@@ -982,31 +962,6 @@
           <w:b/>
           <w:bCs/>
         </w:rPr>
-        <w:t>Fun Facts API</w:t>
-      </w:r>
-      <w:r>
-        <w:rPr>
-          <w:rFonts w:ascii="Calibri" w:hAnsi="Calibri" w:cs="Calibri"/>
-        </w:rPr>
-        <w:t>: Simulates API calls to show random fun facts using a background worker.</w:t>
-      </w:r>
-    </w:p>
-    <w:p>
-      <w:pPr>
-        <w:numPr>
-          <w:ilvl w:val="1"/>
-          <w:numId w:val="4"/>
-        </w:numPr>
-        <w:rPr>
-          <w:rFonts w:ascii="Calibri" w:hAnsi="Calibri" w:cs="Calibri"/>
-        </w:rPr>
-      </w:pPr>
-      <w:r>
-        <w:rPr>
-          <w:rFonts w:ascii="Calibri" w:hAnsi="Calibri" w:cs="Calibri"/>
-          <w:b/>
-          <w:bCs/>
-        </w:rPr>
         <w:t>Event Listener</w:t>
       </w:r>
       <w:r>
@@ -1222,7 +1177,6 @@
           <w:b/>
           <w:bCs/>
         </w:rPr>
-        <w:lastRenderedPageBreak/>
         <w:t>Event Handling</w:t>
       </w:r>
       <w:r>
@@ -1273,6 +1227,7 @@
           <w:b/>
           <w:bCs/>
         </w:rPr>
+        <w:lastRenderedPageBreak/>
         <w:t>Container App</w:t>
       </w:r>
       <w:r>
@@ -1768,7 +1723,6 @@
         <w:rPr>
           <w:rFonts w:ascii="Calibri" w:hAnsi="Calibri" w:cs="Calibri"/>
         </w:rPr>
-        <w:lastRenderedPageBreak/>
         <w:t xml:space="preserve">First, the </w:t>
       </w:r>
       <w:r>
@@ -1870,6 +1824,7 @@
         <w:rPr>
           <w:rFonts w:ascii="Calibri" w:hAnsi="Calibri" w:cs="Calibri"/>
         </w:rPr>
+        <w:lastRenderedPageBreak/>
         <w:t>The Container App seeds and shares data with the micro-frontends via local storage.</w:t>
       </w:r>
     </w:p>
@@ -2232,7 +2187,6 @@
           <w:b/>
           <w:bCs/>
         </w:rPr>
-        <w:lastRenderedPageBreak/>
         <w:t>Message Handling</w:t>
       </w:r>
       <w:r>
@@ -2485,13 +2439,8 @@
                 <w:numId w:val="10"/>
               </w:numPr>
             </w:pPr>
-            <w:proofErr w:type="gramStart"/>
             <w:r>
-              <w:t>Container</w:t>
-            </w:r>
-            <w:proofErr w:type="gramEnd"/>
-            <w:r>
-              <w:t xml:space="preserve"> app is passing data to MFEs dynamically.</w:t>
+              <w:t>Container app is passing data to MFEs dynamically.</w:t>
             </w:r>
           </w:p>
           <w:p>
@@ -2592,28 +2541,6 @@
           <w:p>
             <w:r>
               <w:t>Used SCSS loader</w:t>
-            </w:r>
-          </w:p>
-        </w:tc>
-      </w:tr>
-      <w:tr>
-        <w:tc>
-          <w:tcPr>
-            <w:tcW w:w="5575" w:type="dxa"/>
-          </w:tcPr>
-          <w:p>
-            <w:r>
-              <w:t>Implement any one OWASP top 10</w:t>
-            </w:r>
-          </w:p>
-        </w:tc>
-        <w:tc>
-          <w:tcPr>
-            <w:tcW w:w="3775" w:type="dxa"/>
-          </w:tcPr>
-          <w:p>
-            <w:r>
-              <w:t>Implemented XSS (prevented cross site scripting)</w:t>
             </w:r>
           </w:p>
         </w:tc>

</xml_diff>

<commit_message>
commit for remote deployment link changes
</commit_message>
<xml_diff>
--- a/Microfrontend App HLD.docx
+++ b/Microfrontend App HLD.docx
@@ -843,21 +843,7 @@
         <w:rPr>
           <w:rFonts w:ascii="Calibri" w:hAnsi="Calibri" w:cs="Calibri"/>
         </w:rPr>
-        <w:t xml:space="preserve">: Listens </w:t>
-      </w:r>
-      <w:proofErr w:type="gramStart"/>
-      <w:r>
-        <w:rPr>
-          <w:rFonts w:ascii="Calibri" w:hAnsi="Calibri" w:cs="Calibri"/>
-        </w:rPr>
-        <w:t>for</w:t>
-      </w:r>
-      <w:proofErr w:type="gramEnd"/>
-      <w:r>
-        <w:rPr>
-          <w:rFonts w:ascii="Calibri" w:hAnsi="Calibri" w:cs="Calibri"/>
-        </w:rPr>
-        <w:t xml:space="preserve"> any events (such as "Send Message") from the Container App and shows relevant messages.</w:t>
+        <w:t>: Listens for any events (such as "Send Message") from the Container App and shows relevant messages.</w:t>
       </w:r>
     </w:p>
     <w:p>
@@ -1087,21 +1073,7 @@
         <w:rPr>
           <w:rFonts w:ascii="Calibri" w:hAnsi="Calibri" w:cs="Calibri"/>
         </w:rPr>
-        <w:t xml:space="preserve">: Listens </w:t>
-      </w:r>
-      <w:proofErr w:type="gramStart"/>
-      <w:r>
-        <w:rPr>
-          <w:rFonts w:ascii="Calibri" w:hAnsi="Calibri" w:cs="Calibri"/>
-        </w:rPr>
-        <w:t>for</w:t>
-      </w:r>
-      <w:proofErr w:type="gramEnd"/>
-      <w:r>
-        <w:rPr>
-          <w:rFonts w:ascii="Calibri" w:hAnsi="Calibri" w:cs="Calibri"/>
-        </w:rPr>
-        <w:t xml:space="preserve"> events from the Container App to show notifications.</w:t>
+        <w:t>: Listens for events from the Container App to show notifications.</w:t>
       </w:r>
     </w:p>
     <w:p>
@@ -1574,21 +1546,7 @@
         <w:rPr>
           <w:rFonts w:ascii="Calibri" w:hAnsi="Calibri" w:cs="Calibri"/>
         </w:rPr>
-        <w:t>: Each micro-</w:t>
-      </w:r>
-      <w:proofErr w:type="gramStart"/>
-      <w:r>
-        <w:rPr>
-          <w:rFonts w:ascii="Calibri" w:hAnsi="Calibri" w:cs="Calibri"/>
-        </w:rPr>
-        <w:t>frontend</w:t>
-      </w:r>
-      <w:proofErr w:type="gramEnd"/>
-      <w:r>
-        <w:rPr>
-          <w:rFonts w:ascii="Calibri" w:hAnsi="Calibri" w:cs="Calibri"/>
-        </w:rPr>
-        <w:t xml:space="preserve"> (Container, Users, and Insurance) runs on separate ports (3000, 3001, 3002). </w:t>
+        <w:t xml:space="preserve">: Each micro-frontend (Container, Users, and Insurance) runs on separate ports (3000, 3001, 3002). </w:t>
       </w:r>
     </w:p>
     <w:p>
@@ -2266,6 +2224,181 @@
       <w:pPr>
         <w:rPr>
           <w:rFonts w:ascii="Calibri" w:hAnsi="Calibri" w:cs="Calibri"/>
+        </w:rPr>
+      </w:pPr>
+    </w:p>
+    <w:p>
+      <w:pPr>
+        <w:rPr>
+          <w:rFonts w:ascii="Calibri" w:hAnsi="Calibri" w:cs="Calibri"/>
+          <w:b/>
+          <w:bCs/>
+          <w:lang w:val="en-IN"/>
+        </w:rPr>
+      </w:pPr>
+      <w:r>
+        <w:rPr>
+          <w:rFonts w:ascii="Calibri" w:hAnsi="Calibri" w:cs="Calibri"/>
+          <w:b/>
+          <w:bCs/>
+          <w:lang w:val="en-IN"/>
+        </w:rPr>
+        <w:t>8. Remote Deployment Links (Netlify)</w:t>
+      </w:r>
+    </w:p>
+    <w:p>
+      <w:pPr>
+        <w:pStyle w:val="ListParagraph"/>
+        <w:numPr>
+          <w:ilvl w:val="0"/>
+          <w:numId w:val="14"/>
+        </w:numPr>
+        <w:rPr>
+          <w:rFonts w:ascii="Calibri" w:hAnsi="Calibri" w:cs="Calibri"/>
+          <w:b/>
+          <w:bCs/>
+          <w:lang w:val="en-IN"/>
+        </w:rPr>
+      </w:pPr>
+      <w:r>
+        <w:rPr>
+          <w:rFonts w:ascii="Calibri" w:hAnsi="Calibri" w:cs="Calibri"/>
+          <w:b/>
+          <w:bCs/>
+          <w:lang w:val="en-IN"/>
+        </w:rPr>
+        <w:t xml:space="preserve">Container (main app): </w:t>
+      </w:r>
+      <w:hyperlink r:id="rId7" w:history="1">
+        <w:r>
+          <w:rPr>
+            <w:rStyle w:val="Hyperlink"/>
+            <w:rFonts w:ascii="Calibri" w:hAnsi="Calibri" w:cs="Calibri"/>
+            <w:b/>
+            <w:bCs/>
+            <w:lang w:val="en-IN"/>
+          </w:rPr>
+          <w:t>https://nagp-akansh-container.netlify.app/</w:t>
+        </w:r>
+      </w:hyperlink>
+    </w:p>
+    <w:p>
+      <w:pPr>
+        <w:rPr>
+          <w:rFonts w:ascii="Calibri" w:hAnsi="Calibri" w:cs="Calibri"/>
+          <w:b/>
+          <w:bCs/>
+          <w:lang w:val="en-IN"/>
+        </w:rPr>
+      </w:pPr>
+    </w:p>
+    <w:p>
+      <w:pPr>
+        <w:pStyle w:val="ListParagraph"/>
+        <w:numPr>
+          <w:ilvl w:val="0"/>
+          <w:numId w:val="13"/>
+        </w:numPr>
+        <w:rPr>
+          <w:rFonts w:ascii="Calibri" w:hAnsi="Calibri" w:cs="Calibri"/>
+          <w:b/>
+          <w:bCs/>
+          <w:lang w:val="en-IN"/>
+        </w:rPr>
+      </w:pPr>
+      <w:r>
+        <w:rPr>
+          <w:rFonts w:ascii="Calibri" w:hAnsi="Calibri" w:cs="Calibri"/>
+          <w:b/>
+          <w:bCs/>
+          <w:lang w:val="en-IN"/>
+        </w:rPr>
+        <w:t>Users</w:t>
+      </w:r>
+      <w:r>
+        <w:rPr>
+          <w:rFonts w:ascii="Calibri" w:hAnsi="Calibri" w:cs="Calibri"/>
+          <w:b/>
+          <w:bCs/>
+          <w:lang w:val="en-IN"/>
+        </w:rPr>
+        <w:t xml:space="preserve"> micro-frontend: </w:t>
+      </w:r>
+      <w:hyperlink r:id="rId8" w:history="1">
+        <w:r>
+          <w:rPr>
+            <w:rStyle w:val="Hyperlink"/>
+            <w:rFonts w:ascii="Calibri" w:hAnsi="Calibri" w:cs="Calibri"/>
+            <w:b/>
+            <w:bCs/>
+            <w:lang w:val="en-IN"/>
+          </w:rPr>
+          <w:t>https://nagp-akansh-user.netlify.app/</w:t>
+        </w:r>
+      </w:hyperlink>
+    </w:p>
+    <w:p>
+      <w:pPr>
+        <w:rPr>
+          <w:rFonts w:ascii="Calibri" w:hAnsi="Calibri" w:cs="Calibri"/>
+          <w:b/>
+          <w:bCs/>
+          <w:lang w:val="en-IN"/>
+        </w:rPr>
+      </w:pPr>
+    </w:p>
+    <w:p>
+      <w:pPr>
+        <w:pStyle w:val="ListParagraph"/>
+        <w:numPr>
+          <w:ilvl w:val="0"/>
+          <w:numId w:val="7"/>
+        </w:numPr>
+        <w:rPr>
+          <w:rFonts w:ascii="Calibri" w:hAnsi="Calibri" w:cs="Calibri"/>
+          <w:b/>
+          <w:bCs/>
+          <w:lang w:val="pt-PT"/>
+        </w:rPr>
+      </w:pPr>
+      <w:r>
+        <w:rPr>
+          <w:rFonts w:ascii="Calibri" w:hAnsi="Calibri" w:cs="Calibri"/>
+          <w:b/>
+          <w:bCs/>
+          <w:lang w:val="pt-PT"/>
+        </w:rPr>
+        <w:t xml:space="preserve">Insurance micro-frontend: </w:t>
+      </w:r>
+      <w:hyperlink r:id="rId9" w:history="1">
+        <w:r>
+          <w:rPr>
+            <w:rStyle w:val="Hyperlink"/>
+            <w:rFonts w:ascii="Calibri" w:hAnsi="Calibri" w:cs="Calibri"/>
+            <w:b/>
+            <w:bCs/>
+            <w:lang w:val="pt-PT"/>
+          </w:rPr>
+          <w:t>https://nagp-akansh-insurance.netlify.app/</w:t>
+        </w:r>
+      </w:hyperlink>
+    </w:p>
+    <w:p>
+      <w:pPr>
+        <w:ind w:left="360"/>
+        <w:rPr>
+          <w:rFonts w:ascii="Calibri" w:hAnsi="Calibri" w:cs="Calibri"/>
+          <w:b/>
+          <w:bCs/>
+          <w:lang w:val="pt-PT"/>
+        </w:rPr>
+      </w:pPr>
+    </w:p>
+    <w:p>
+      <w:pPr>
+        <w:rPr>
+          <w:rFonts w:ascii="Calibri" w:hAnsi="Calibri" w:cs="Calibri"/>
+          <w:lang w:val="pt-PT"/>
         </w:rPr>
       </w:pPr>
     </w:p>
@@ -2573,6 +2706,318 @@
 <file path=word/numbering.xml><?xml version="1.0" encoding="utf-8"?>
 <w:numbering xmlns:wpc="http://schemas.microsoft.com/office/word/2010/wordprocessingCanvas" xmlns:cx="http://schemas.microsoft.com/office/drawing/2014/chartex" xmlns:cx1="http://schemas.microsoft.com/office/drawing/2015/9/8/chartex" xmlns:cx2="http://schemas.microsoft.com/office/drawing/2015/10/21/chartex" xmlns:cx3="http://schemas.microsoft.com/office/drawing/2016/5/9/chartex" xmlns:cx4="http://schemas.microsoft.com/office/drawing/2016/5/10/chartex" xmlns:cx5="http://schemas.microsoft.com/office/drawing/2016/5/11/chartex" xmlns:cx6="http://schemas.microsoft.com/office/drawing/2016/5/12/chartex" xmlns:cx7="http://schemas.microsoft.com/office/drawing/2016/5/13/chartex" xmlns:cx8="http://schemas.microsoft.com/office/drawing/2016/5/14/chartex" xmlns:mc="http://schemas.openxmlformats.org/markup-compatibility/2006" xmlns:aink="http://schemas.microsoft.com/office/drawing/2016/ink" xmlns:am3d="http://schemas.microsoft.com/office/drawing/2017/model3d" xmlns:o="urn:schemas-microsoft-com:office:office" xmlns:oel="http://schemas.microsoft.com/office/2019/extlst" xmlns:r="http://schemas.openxmlformats.org/officeDocument/2006/relationships" xmlns:m="http://schemas.openxmlformats.org/officeDocument/2006/math" xmlns:v="urn:schemas-microsoft-com:vml" xmlns:wp14="http://schemas.microsoft.com/office/word/2010/wordprocessingDrawing" xmlns:wp="http://schemas.openxmlformats.org/drawingml/2006/wordprocessingDrawing" xmlns:w10="urn:schemas-microsoft-com:office:word" xmlns:w="http://schemas.openxmlformats.org/wordprocessingml/2006/main" xmlns:w14="http://schemas.microsoft.com/office/word/2010/wordml" xmlns:w15="http://schemas.microsoft.com/office/word/2012/wordml" xmlns:w16cex="http://schemas.microsoft.com/office/word/2018/wordml/cex" xmlns:w16cid="http://schemas.microsoft.com/office/word/2016/wordml/cid" xmlns:w16="http://schemas.microsoft.com/office/word/2018/wordml" xmlns:w16du="http://schemas.microsoft.com/office/word/2023/wordml/word16du" xmlns:w16sdtdh="http://schemas.microsoft.com/office/word/2020/wordml/sdtdatahash" xmlns:w16sdtfl="http://schemas.microsoft.com/office/word/2024/wordml/sdtformatlock" xmlns:w16se="http://schemas.microsoft.com/office/word/2015/wordml/symex" xmlns:wpg="http://schemas.microsoft.com/office/word/2010/wordprocessingGroup" xmlns:wpi="http://schemas.microsoft.com/office/word/2010/wordprocessingInk" xmlns:wne="http://schemas.microsoft.com/office/word/2006/wordml" xmlns:wps="http://schemas.microsoft.com/office/word/2010/wordprocessingShape" mc:Ignorable="w14 w15 w16se w16cid w16 w16cex w16sdtdh w16sdtfl w16du wp14">
   <w:abstractNum w:abstractNumId="0" w15:restartNumberingAfterBreak="0">
+    <w:nsid w:val="068142BE"/>
+    <w:multiLevelType w:val="hybridMultilevel"/>
+    <w:tmpl w:val="5DBA3B04"/>
+    <w:lvl w:ilvl="0" w:tplc="4009000B">
+      <w:start w:val="1"/>
+      <w:numFmt w:val="bullet"/>
+      <w:lvlText w:val=""/>
+      <w:lvlJc w:val="left"/>
+      <w:pPr>
+        <w:ind w:left="720" w:hanging="360"/>
+      </w:pPr>
+      <w:rPr>
+        <w:rFonts w:ascii="Wingdings" w:hAnsi="Wingdings" w:hint="default"/>
+      </w:rPr>
+    </w:lvl>
+    <w:lvl w:ilvl="1" w:tplc="40090003" w:tentative="1">
+      <w:start w:val="1"/>
+      <w:numFmt w:val="bullet"/>
+      <w:lvlText w:val="o"/>
+      <w:lvlJc w:val="left"/>
+      <w:pPr>
+        <w:ind w:left="1440" w:hanging="360"/>
+      </w:pPr>
+      <w:rPr>
+        <w:rFonts w:ascii="Courier New" w:hAnsi="Courier New" w:cs="Courier New" w:hint="default"/>
+      </w:rPr>
+    </w:lvl>
+    <w:lvl w:ilvl="2" w:tplc="40090005" w:tentative="1">
+      <w:start w:val="1"/>
+      <w:numFmt w:val="bullet"/>
+      <w:lvlText w:val=""/>
+      <w:lvlJc w:val="left"/>
+      <w:pPr>
+        <w:ind w:left="2160" w:hanging="360"/>
+      </w:pPr>
+      <w:rPr>
+        <w:rFonts w:ascii="Wingdings" w:hAnsi="Wingdings" w:hint="default"/>
+      </w:rPr>
+    </w:lvl>
+    <w:lvl w:ilvl="3" w:tplc="40090001" w:tentative="1">
+      <w:start w:val="1"/>
+      <w:numFmt w:val="bullet"/>
+      <w:lvlText w:val=""/>
+      <w:lvlJc w:val="left"/>
+      <w:pPr>
+        <w:ind w:left="2880" w:hanging="360"/>
+      </w:pPr>
+      <w:rPr>
+        <w:rFonts w:ascii="Symbol" w:hAnsi="Symbol" w:hint="default"/>
+      </w:rPr>
+    </w:lvl>
+    <w:lvl w:ilvl="4" w:tplc="40090003" w:tentative="1">
+      <w:start w:val="1"/>
+      <w:numFmt w:val="bullet"/>
+      <w:lvlText w:val="o"/>
+      <w:lvlJc w:val="left"/>
+      <w:pPr>
+        <w:ind w:left="3600" w:hanging="360"/>
+      </w:pPr>
+      <w:rPr>
+        <w:rFonts w:ascii="Courier New" w:hAnsi="Courier New" w:cs="Courier New" w:hint="default"/>
+      </w:rPr>
+    </w:lvl>
+    <w:lvl w:ilvl="5" w:tplc="40090005" w:tentative="1">
+      <w:start w:val="1"/>
+      <w:numFmt w:val="bullet"/>
+      <w:lvlText w:val=""/>
+      <w:lvlJc w:val="left"/>
+      <w:pPr>
+        <w:ind w:left="4320" w:hanging="360"/>
+      </w:pPr>
+      <w:rPr>
+        <w:rFonts w:ascii="Wingdings" w:hAnsi="Wingdings" w:hint="default"/>
+      </w:rPr>
+    </w:lvl>
+    <w:lvl w:ilvl="6" w:tplc="40090001" w:tentative="1">
+      <w:start w:val="1"/>
+      <w:numFmt w:val="bullet"/>
+      <w:lvlText w:val=""/>
+      <w:lvlJc w:val="left"/>
+      <w:pPr>
+        <w:ind w:left="5040" w:hanging="360"/>
+      </w:pPr>
+      <w:rPr>
+        <w:rFonts w:ascii="Symbol" w:hAnsi="Symbol" w:hint="default"/>
+      </w:rPr>
+    </w:lvl>
+    <w:lvl w:ilvl="7" w:tplc="40090003" w:tentative="1">
+      <w:start w:val="1"/>
+      <w:numFmt w:val="bullet"/>
+      <w:lvlText w:val="o"/>
+      <w:lvlJc w:val="left"/>
+      <w:pPr>
+        <w:ind w:left="5760" w:hanging="360"/>
+      </w:pPr>
+      <w:rPr>
+        <w:rFonts w:ascii="Courier New" w:hAnsi="Courier New" w:cs="Courier New" w:hint="default"/>
+      </w:rPr>
+    </w:lvl>
+    <w:lvl w:ilvl="8" w:tplc="40090005" w:tentative="1">
+      <w:start w:val="1"/>
+      <w:numFmt w:val="bullet"/>
+      <w:lvlText w:val=""/>
+      <w:lvlJc w:val="left"/>
+      <w:pPr>
+        <w:ind w:left="6480" w:hanging="360"/>
+      </w:pPr>
+      <w:rPr>
+        <w:rFonts w:ascii="Wingdings" w:hAnsi="Wingdings" w:hint="default"/>
+      </w:rPr>
+    </w:lvl>
+  </w:abstractNum>
+  <w:abstractNum w:abstractNumId="1" w15:restartNumberingAfterBreak="0">
+    <w:nsid w:val="0C055744"/>
+    <w:multiLevelType w:val="hybridMultilevel"/>
+    <w:tmpl w:val="03DC60A4"/>
+    <w:lvl w:ilvl="0" w:tplc="4009000F">
+      <w:start w:val="1"/>
+      <w:numFmt w:val="decimal"/>
+      <w:lvlText w:val="%1."/>
+      <w:lvlJc w:val="left"/>
+      <w:pPr>
+        <w:ind w:left="990" w:hanging="360"/>
+      </w:pPr>
+    </w:lvl>
+    <w:lvl w:ilvl="1" w:tplc="40090019" w:tentative="1">
+      <w:start w:val="1"/>
+      <w:numFmt w:val="lowerLetter"/>
+      <w:lvlText w:val="%2."/>
+      <w:lvlJc w:val="left"/>
+      <w:pPr>
+        <w:ind w:left="1710" w:hanging="360"/>
+      </w:pPr>
+    </w:lvl>
+    <w:lvl w:ilvl="2" w:tplc="4009001B" w:tentative="1">
+      <w:start w:val="1"/>
+      <w:numFmt w:val="lowerRoman"/>
+      <w:lvlText w:val="%3."/>
+      <w:lvlJc w:val="right"/>
+      <w:pPr>
+        <w:ind w:left="2430" w:hanging="180"/>
+      </w:pPr>
+    </w:lvl>
+    <w:lvl w:ilvl="3" w:tplc="4009000F" w:tentative="1">
+      <w:start w:val="1"/>
+      <w:numFmt w:val="decimal"/>
+      <w:lvlText w:val="%4."/>
+      <w:lvlJc w:val="left"/>
+      <w:pPr>
+        <w:ind w:left="3150" w:hanging="360"/>
+      </w:pPr>
+    </w:lvl>
+    <w:lvl w:ilvl="4" w:tplc="40090019" w:tentative="1">
+      <w:start w:val="1"/>
+      <w:numFmt w:val="lowerLetter"/>
+      <w:lvlText w:val="%5."/>
+      <w:lvlJc w:val="left"/>
+      <w:pPr>
+        <w:ind w:left="3870" w:hanging="360"/>
+      </w:pPr>
+    </w:lvl>
+    <w:lvl w:ilvl="5" w:tplc="4009001B" w:tentative="1">
+      <w:start w:val="1"/>
+      <w:numFmt w:val="lowerRoman"/>
+      <w:lvlText w:val="%6."/>
+      <w:lvlJc w:val="right"/>
+      <w:pPr>
+        <w:ind w:left="4590" w:hanging="180"/>
+      </w:pPr>
+    </w:lvl>
+    <w:lvl w:ilvl="6" w:tplc="4009000F" w:tentative="1">
+      <w:start w:val="1"/>
+      <w:numFmt w:val="decimal"/>
+      <w:lvlText w:val="%7."/>
+      <w:lvlJc w:val="left"/>
+      <w:pPr>
+        <w:ind w:left="5310" w:hanging="360"/>
+      </w:pPr>
+    </w:lvl>
+    <w:lvl w:ilvl="7" w:tplc="40090019" w:tentative="1">
+      <w:start w:val="1"/>
+      <w:numFmt w:val="lowerLetter"/>
+      <w:lvlText w:val="%8."/>
+      <w:lvlJc w:val="left"/>
+      <w:pPr>
+        <w:ind w:left="6030" w:hanging="360"/>
+      </w:pPr>
+    </w:lvl>
+    <w:lvl w:ilvl="8" w:tplc="4009001B" w:tentative="1">
+      <w:start w:val="1"/>
+      <w:numFmt w:val="lowerRoman"/>
+      <w:lvlText w:val="%9."/>
+      <w:lvlJc w:val="right"/>
+      <w:pPr>
+        <w:ind w:left="6750" w:hanging="180"/>
+      </w:pPr>
+    </w:lvl>
+  </w:abstractNum>
+  <w:abstractNum w:abstractNumId="2" w15:restartNumberingAfterBreak="0">
+    <w:nsid w:val="16283456"/>
+    <w:multiLevelType w:val="hybridMultilevel"/>
+    <w:tmpl w:val="1EA02C28"/>
+    <w:lvl w:ilvl="0" w:tplc="4009000B">
+      <w:start w:val="1"/>
+      <w:numFmt w:val="bullet"/>
+      <w:lvlText w:val=""/>
+      <w:lvlJc w:val="left"/>
+      <w:pPr>
+        <w:ind w:left="720" w:hanging="360"/>
+      </w:pPr>
+      <w:rPr>
+        <w:rFonts w:ascii="Wingdings" w:hAnsi="Wingdings" w:hint="default"/>
+      </w:rPr>
+    </w:lvl>
+    <w:lvl w:ilvl="1" w:tplc="40090003" w:tentative="1">
+      <w:start w:val="1"/>
+      <w:numFmt w:val="bullet"/>
+      <w:lvlText w:val="o"/>
+      <w:lvlJc w:val="left"/>
+      <w:pPr>
+        <w:ind w:left="1440" w:hanging="360"/>
+      </w:pPr>
+      <w:rPr>
+        <w:rFonts w:ascii="Courier New" w:hAnsi="Courier New" w:cs="Courier New" w:hint="default"/>
+      </w:rPr>
+    </w:lvl>
+    <w:lvl w:ilvl="2" w:tplc="40090005" w:tentative="1">
+      <w:start w:val="1"/>
+      <w:numFmt w:val="bullet"/>
+      <w:lvlText w:val=""/>
+      <w:lvlJc w:val="left"/>
+      <w:pPr>
+        <w:ind w:left="2160" w:hanging="360"/>
+      </w:pPr>
+      <w:rPr>
+        <w:rFonts w:ascii="Wingdings" w:hAnsi="Wingdings" w:hint="default"/>
+      </w:rPr>
+    </w:lvl>
+    <w:lvl w:ilvl="3" w:tplc="40090001" w:tentative="1">
+      <w:start w:val="1"/>
+      <w:numFmt w:val="bullet"/>
+      <w:lvlText w:val=""/>
+      <w:lvlJc w:val="left"/>
+      <w:pPr>
+        <w:ind w:left="2880" w:hanging="360"/>
+      </w:pPr>
+      <w:rPr>
+        <w:rFonts w:ascii="Symbol" w:hAnsi="Symbol" w:hint="default"/>
+      </w:rPr>
+    </w:lvl>
+    <w:lvl w:ilvl="4" w:tplc="40090003" w:tentative="1">
+      <w:start w:val="1"/>
+      <w:numFmt w:val="bullet"/>
+      <w:lvlText w:val="o"/>
+      <w:lvlJc w:val="left"/>
+      <w:pPr>
+        <w:ind w:left="3600" w:hanging="360"/>
+      </w:pPr>
+      <w:rPr>
+        <w:rFonts w:ascii="Courier New" w:hAnsi="Courier New" w:cs="Courier New" w:hint="default"/>
+      </w:rPr>
+    </w:lvl>
+    <w:lvl w:ilvl="5" w:tplc="40090005" w:tentative="1">
+      <w:start w:val="1"/>
+      <w:numFmt w:val="bullet"/>
+      <w:lvlText w:val=""/>
+      <w:lvlJc w:val="left"/>
+      <w:pPr>
+        <w:ind w:left="4320" w:hanging="360"/>
+      </w:pPr>
+      <w:rPr>
+        <w:rFonts w:ascii="Wingdings" w:hAnsi="Wingdings" w:hint="default"/>
+      </w:rPr>
+    </w:lvl>
+    <w:lvl w:ilvl="6" w:tplc="40090001" w:tentative="1">
+      <w:start w:val="1"/>
+      <w:numFmt w:val="bullet"/>
+      <w:lvlText w:val=""/>
+      <w:lvlJc w:val="left"/>
+      <w:pPr>
+        <w:ind w:left="5040" w:hanging="360"/>
+      </w:pPr>
+      <w:rPr>
+        <w:rFonts w:ascii="Symbol" w:hAnsi="Symbol" w:hint="default"/>
+      </w:rPr>
+    </w:lvl>
+    <w:lvl w:ilvl="7" w:tplc="40090003" w:tentative="1">
+      <w:start w:val="1"/>
+      <w:numFmt w:val="bullet"/>
+      <w:lvlText w:val="o"/>
+      <w:lvlJc w:val="left"/>
+      <w:pPr>
+        <w:ind w:left="5760" w:hanging="360"/>
+      </w:pPr>
+      <w:rPr>
+        <w:rFonts w:ascii="Courier New" w:hAnsi="Courier New" w:cs="Courier New" w:hint="default"/>
+      </w:rPr>
+    </w:lvl>
+    <w:lvl w:ilvl="8" w:tplc="40090005" w:tentative="1">
+      <w:start w:val="1"/>
+      <w:numFmt w:val="bullet"/>
+      <w:lvlText w:val=""/>
+      <w:lvlJc w:val="left"/>
+      <w:pPr>
+        <w:ind w:left="6480" w:hanging="360"/>
+      </w:pPr>
+      <w:rPr>
+        <w:rFonts w:ascii="Wingdings" w:hAnsi="Wingdings" w:hint="default"/>
+      </w:rPr>
+    </w:lvl>
+  </w:abstractNum>
+  <w:abstractNum w:abstractNumId="3" w15:restartNumberingAfterBreak="0">
     <w:nsid w:val="188270F6"/>
     <w:multiLevelType w:val="multilevel"/>
     <w:tmpl w:val="9C3E7D7C"/>
@@ -2689,7 +3134,7 @@
       </w:pPr>
     </w:lvl>
   </w:abstractNum>
-  <w:abstractNum w:abstractNumId="1" w15:restartNumberingAfterBreak="0">
+  <w:abstractNum w:abstractNumId="4" w15:restartNumberingAfterBreak="0">
     <w:nsid w:val="23BD364E"/>
     <w:multiLevelType w:val="hybridMultilevel"/>
     <w:tmpl w:val="FD380B9E"/>
@@ -2802,7 +3247,7 @@
       </w:rPr>
     </w:lvl>
   </w:abstractNum>
-  <w:abstractNum w:abstractNumId="2" w15:restartNumberingAfterBreak="0">
+  <w:abstractNum w:abstractNumId="5" w15:restartNumberingAfterBreak="0">
     <w:nsid w:val="2A844D09"/>
     <w:multiLevelType w:val="multilevel"/>
     <w:tmpl w:val="38E0321E"/>
@@ -2951,7 +3396,7 @@
       </w:rPr>
     </w:lvl>
   </w:abstractNum>
-  <w:abstractNum w:abstractNumId="3" w15:restartNumberingAfterBreak="0">
+  <w:abstractNum w:abstractNumId="6" w15:restartNumberingAfterBreak="0">
     <w:nsid w:val="394B1EE6"/>
     <w:multiLevelType w:val="multilevel"/>
     <w:tmpl w:val="04D83F22"/>
@@ -3100,10 +3545,10 @@
       </w:rPr>
     </w:lvl>
   </w:abstractNum>
-  <w:abstractNum w:abstractNumId="4" w15:restartNumberingAfterBreak="0">
+  <w:abstractNum w:abstractNumId="7" w15:restartNumberingAfterBreak="0">
     <w:nsid w:val="3B3223AB"/>
     <w:multiLevelType w:val="multilevel"/>
-    <w:tmpl w:val="07C43516"/>
+    <w:tmpl w:val="8266FAB6"/>
     <w:lvl w:ilvl="0">
       <w:start w:val="1"/>
       <w:numFmt w:val="bullet"/>
@@ -3136,127 +3581,123 @@
         <w:sz w:val="20"/>
       </w:rPr>
     </w:lvl>
-    <w:lvl w:ilvl="2" w:tentative="1">
+    <w:lvl w:ilvl="2">
+      <w:start w:val="1"/>
+      <w:numFmt w:val="decimal"/>
+      <w:lvlText w:val="%3."/>
+      <w:lvlJc w:val="left"/>
+      <w:pPr>
+        <w:ind w:left="2160" w:hanging="360"/>
+      </w:pPr>
+      <w:rPr>
+        <w:rFonts w:hint="default"/>
+      </w:rPr>
+    </w:lvl>
+    <w:lvl w:ilvl="3" w:tentative="1">
       <w:start w:val="1"/>
       <w:numFmt w:val="bullet"/>
       <w:lvlText w:val=""/>
       <w:lvlJc w:val="left"/>
       <w:pPr>
         <w:tabs>
-          <w:tab w:val="num" w:pos="2160"/>
-        </w:tabs>
-        <w:ind w:left="2160" w:hanging="360"/>
+          <w:tab w:val="num" w:pos="2880"/>
+        </w:tabs>
+        <w:ind w:left="2880" w:hanging="360"/>
       </w:pPr>
       <w:rPr>
         <w:rFonts w:ascii="Wingdings" w:hAnsi="Wingdings" w:hint="default"/>
         <w:sz w:val="20"/>
       </w:rPr>
     </w:lvl>
-    <w:lvl w:ilvl="3" w:tentative="1">
+    <w:lvl w:ilvl="4" w:tentative="1">
       <w:start w:val="1"/>
       <w:numFmt w:val="bullet"/>
       <w:lvlText w:val=""/>
       <w:lvlJc w:val="left"/>
       <w:pPr>
         <w:tabs>
-          <w:tab w:val="num" w:pos="2880"/>
-        </w:tabs>
-        <w:ind w:left="2880" w:hanging="360"/>
+          <w:tab w:val="num" w:pos="3600"/>
+        </w:tabs>
+        <w:ind w:left="3600" w:hanging="360"/>
       </w:pPr>
       <w:rPr>
         <w:rFonts w:ascii="Wingdings" w:hAnsi="Wingdings" w:hint="default"/>
         <w:sz w:val="20"/>
       </w:rPr>
     </w:lvl>
-    <w:lvl w:ilvl="4" w:tentative="1">
+    <w:lvl w:ilvl="5" w:tentative="1">
       <w:start w:val="1"/>
       <w:numFmt w:val="bullet"/>
       <w:lvlText w:val=""/>
       <w:lvlJc w:val="left"/>
       <w:pPr>
         <w:tabs>
-          <w:tab w:val="num" w:pos="3600"/>
-        </w:tabs>
-        <w:ind w:left="3600" w:hanging="360"/>
+          <w:tab w:val="num" w:pos="4320"/>
+        </w:tabs>
+        <w:ind w:left="4320" w:hanging="360"/>
       </w:pPr>
       <w:rPr>
         <w:rFonts w:ascii="Wingdings" w:hAnsi="Wingdings" w:hint="default"/>
         <w:sz w:val="20"/>
       </w:rPr>
     </w:lvl>
-    <w:lvl w:ilvl="5" w:tentative="1">
+    <w:lvl w:ilvl="6" w:tentative="1">
       <w:start w:val="1"/>
       <w:numFmt w:val="bullet"/>
       <w:lvlText w:val=""/>
       <w:lvlJc w:val="left"/>
       <w:pPr>
         <w:tabs>
-          <w:tab w:val="num" w:pos="4320"/>
-        </w:tabs>
-        <w:ind w:left="4320" w:hanging="360"/>
+          <w:tab w:val="num" w:pos="5040"/>
+        </w:tabs>
+        <w:ind w:left="5040" w:hanging="360"/>
       </w:pPr>
       <w:rPr>
         <w:rFonts w:ascii="Wingdings" w:hAnsi="Wingdings" w:hint="default"/>
         <w:sz w:val="20"/>
       </w:rPr>
     </w:lvl>
-    <w:lvl w:ilvl="6" w:tentative="1">
+    <w:lvl w:ilvl="7" w:tentative="1">
       <w:start w:val="1"/>
       <w:numFmt w:val="bullet"/>
       <w:lvlText w:val=""/>
       <w:lvlJc w:val="left"/>
       <w:pPr>
         <w:tabs>
-          <w:tab w:val="num" w:pos="5040"/>
-        </w:tabs>
-        <w:ind w:left="5040" w:hanging="360"/>
+          <w:tab w:val="num" w:pos="5760"/>
+        </w:tabs>
+        <w:ind w:left="5760" w:hanging="360"/>
       </w:pPr>
       <w:rPr>
         <w:rFonts w:ascii="Wingdings" w:hAnsi="Wingdings" w:hint="default"/>
         <w:sz w:val="20"/>
       </w:rPr>
     </w:lvl>
-    <w:lvl w:ilvl="7" w:tentative="1">
+    <w:lvl w:ilvl="8" w:tentative="1">
       <w:start w:val="1"/>
       <w:numFmt w:val="bullet"/>
       <w:lvlText w:val=""/>
       <w:lvlJc w:val="left"/>
       <w:pPr>
         <w:tabs>
-          <w:tab w:val="num" w:pos="5760"/>
-        </w:tabs>
-        <w:ind w:left="5760" w:hanging="360"/>
+          <w:tab w:val="num" w:pos="6480"/>
+        </w:tabs>
+        <w:ind w:left="6480" w:hanging="360"/>
       </w:pPr>
       <w:rPr>
         <w:rFonts w:ascii="Wingdings" w:hAnsi="Wingdings" w:hint="default"/>
         <w:sz w:val="20"/>
       </w:rPr>
     </w:lvl>
-    <w:lvl w:ilvl="8" w:tentative="1">
-      <w:start w:val="1"/>
-      <w:numFmt w:val="bullet"/>
-      <w:lvlText w:val=""/>
-      <w:lvlJc w:val="left"/>
-      <w:pPr>
-        <w:tabs>
-          <w:tab w:val="num" w:pos="6480"/>
-        </w:tabs>
-        <w:ind w:left="6480" w:hanging="360"/>
-      </w:pPr>
-      <w:rPr>
-        <w:rFonts w:ascii="Wingdings" w:hAnsi="Wingdings" w:hint="default"/>
-        <w:sz w:val="20"/>
-      </w:rPr>
-    </w:lvl>
   </w:abstractNum>
-  <w:abstractNum w:abstractNumId="5" w15:restartNumberingAfterBreak="0">
+  <w:abstractNum w:abstractNumId="8" w15:restartNumberingAfterBreak="0">
     <w:nsid w:val="4B496248"/>
     <w:multiLevelType w:val="multilevel"/>
-    <w:tmpl w:val="754EBF68"/>
+    <w:tmpl w:val="3FE2312A"/>
     <w:lvl w:ilvl="0">
       <w:start w:val="1"/>
-      <w:numFmt w:val="decimal"/>
-      <w:lvlText w:val="%1."/>
+      <w:numFmt w:val="bullet"/>
+      <w:lvlText w:val=""/>
       <w:lvlJc w:val="left"/>
       <w:pPr>
         <w:tabs>
@@ -3264,6 +3705,9 @@
         </w:tabs>
         <w:ind w:left="720" w:hanging="360"/>
       </w:pPr>
+      <w:rPr>
+        <w:rFonts w:ascii="Wingdings" w:hAnsi="Wingdings" w:hint="default"/>
+      </w:rPr>
     </w:lvl>
     <w:lvl w:ilvl="1">
       <w:start w:val="1"/>
@@ -3366,7 +3810,7 @@
       </w:pPr>
     </w:lvl>
   </w:abstractNum>
-  <w:abstractNum w:abstractNumId="6" w15:restartNumberingAfterBreak="0">
+  <w:abstractNum w:abstractNumId="9" w15:restartNumberingAfterBreak="0">
     <w:nsid w:val="60B00422"/>
     <w:multiLevelType w:val="multilevel"/>
     <w:tmpl w:val="8496F0DE"/>
@@ -3515,7 +3959,7 @@
       </w:rPr>
     </w:lvl>
   </w:abstractNum>
-  <w:abstractNum w:abstractNumId="7" w15:restartNumberingAfterBreak="0">
+  <w:abstractNum w:abstractNumId="10" w15:restartNumberingAfterBreak="0">
     <w:nsid w:val="69AA7320"/>
     <w:multiLevelType w:val="multilevel"/>
     <w:tmpl w:val="B66CE5E6"/>
@@ -3664,7 +4108,7 @@
       </w:rPr>
     </w:lvl>
   </w:abstractNum>
-  <w:abstractNum w:abstractNumId="8" w15:restartNumberingAfterBreak="0">
+  <w:abstractNum w:abstractNumId="11" w15:restartNumberingAfterBreak="0">
     <w:nsid w:val="6B461C3B"/>
     <w:multiLevelType w:val="multilevel"/>
     <w:tmpl w:val="777AF396"/>
@@ -3777,7 +4221,120 @@
       </w:pPr>
     </w:lvl>
   </w:abstractNum>
-  <w:abstractNum w:abstractNumId="9" w15:restartNumberingAfterBreak="0">
+  <w:abstractNum w:abstractNumId="12" w15:restartNumberingAfterBreak="0">
+    <w:nsid w:val="6F4E401E"/>
+    <w:multiLevelType w:val="hybridMultilevel"/>
+    <w:tmpl w:val="240EB926"/>
+    <w:lvl w:ilvl="0" w:tplc="4009000B">
+      <w:start w:val="1"/>
+      <w:numFmt w:val="bullet"/>
+      <w:lvlText w:val=""/>
+      <w:lvlJc w:val="left"/>
+      <w:pPr>
+        <w:ind w:left="720" w:hanging="360"/>
+      </w:pPr>
+      <w:rPr>
+        <w:rFonts w:ascii="Wingdings" w:hAnsi="Wingdings" w:hint="default"/>
+      </w:rPr>
+    </w:lvl>
+    <w:lvl w:ilvl="1" w:tplc="40090003" w:tentative="1">
+      <w:start w:val="1"/>
+      <w:numFmt w:val="bullet"/>
+      <w:lvlText w:val="o"/>
+      <w:lvlJc w:val="left"/>
+      <w:pPr>
+        <w:ind w:left="1440" w:hanging="360"/>
+      </w:pPr>
+      <w:rPr>
+        <w:rFonts w:ascii="Courier New" w:hAnsi="Courier New" w:cs="Courier New" w:hint="default"/>
+      </w:rPr>
+    </w:lvl>
+    <w:lvl w:ilvl="2" w:tplc="40090005">
+      <w:start w:val="1"/>
+      <w:numFmt w:val="bullet"/>
+      <w:lvlText w:val=""/>
+      <w:lvlJc w:val="left"/>
+      <w:pPr>
+        <w:ind w:left="2160" w:hanging="360"/>
+      </w:pPr>
+      <w:rPr>
+        <w:rFonts w:ascii="Wingdings" w:hAnsi="Wingdings" w:hint="default"/>
+      </w:rPr>
+    </w:lvl>
+    <w:lvl w:ilvl="3" w:tplc="40090001" w:tentative="1">
+      <w:start w:val="1"/>
+      <w:numFmt w:val="bullet"/>
+      <w:lvlText w:val=""/>
+      <w:lvlJc w:val="left"/>
+      <w:pPr>
+        <w:ind w:left="2880" w:hanging="360"/>
+      </w:pPr>
+      <w:rPr>
+        <w:rFonts w:ascii="Symbol" w:hAnsi="Symbol" w:hint="default"/>
+      </w:rPr>
+    </w:lvl>
+    <w:lvl w:ilvl="4" w:tplc="40090003" w:tentative="1">
+      <w:start w:val="1"/>
+      <w:numFmt w:val="bullet"/>
+      <w:lvlText w:val="o"/>
+      <w:lvlJc w:val="left"/>
+      <w:pPr>
+        <w:ind w:left="3600" w:hanging="360"/>
+      </w:pPr>
+      <w:rPr>
+        <w:rFonts w:ascii="Courier New" w:hAnsi="Courier New" w:cs="Courier New" w:hint="default"/>
+      </w:rPr>
+    </w:lvl>
+    <w:lvl w:ilvl="5" w:tplc="40090005" w:tentative="1">
+      <w:start w:val="1"/>
+      <w:numFmt w:val="bullet"/>
+      <w:lvlText w:val=""/>
+      <w:lvlJc w:val="left"/>
+      <w:pPr>
+        <w:ind w:left="4320" w:hanging="360"/>
+      </w:pPr>
+      <w:rPr>
+        <w:rFonts w:ascii="Wingdings" w:hAnsi="Wingdings" w:hint="default"/>
+      </w:rPr>
+    </w:lvl>
+    <w:lvl w:ilvl="6" w:tplc="40090001" w:tentative="1">
+      <w:start w:val="1"/>
+      <w:numFmt w:val="bullet"/>
+      <w:lvlText w:val=""/>
+      <w:lvlJc w:val="left"/>
+      <w:pPr>
+        <w:ind w:left="5040" w:hanging="360"/>
+      </w:pPr>
+      <w:rPr>
+        <w:rFonts w:ascii="Symbol" w:hAnsi="Symbol" w:hint="default"/>
+      </w:rPr>
+    </w:lvl>
+    <w:lvl w:ilvl="7" w:tplc="40090003" w:tentative="1">
+      <w:start w:val="1"/>
+      <w:numFmt w:val="bullet"/>
+      <w:lvlText w:val="o"/>
+      <w:lvlJc w:val="left"/>
+      <w:pPr>
+        <w:ind w:left="5760" w:hanging="360"/>
+      </w:pPr>
+      <w:rPr>
+        <w:rFonts w:ascii="Courier New" w:hAnsi="Courier New" w:cs="Courier New" w:hint="default"/>
+      </w:rPr>
+    </w:lvl>
+    <w:lvl w:ilvl="8" w:tplc="40090005" w:tentative="1">
+      <w:start w:val="1"/>
+      <w:numFmt w:val="bullet"/>
+      <w:lvlText w:val=""/>
+      <w:lvlJc w:val="left"/>
+      <w:pPr>
+        <w:ind w:left="6480" w:hanging="360"/>
+      </w:pPr>
+      <w:rPr>
+        <w:rFonts w:ascii="Wingdings" w:hAnsi="Wingdings" w:hint="default"/>
+      </w:rPr>
+    </w:lvl>
+  </w:abstractNum>
+  <w:abstractNum w:abstractNumId="13" w15:restartNumberingAfterBreak="0">
     <w:nsid w:val="77280502"/>
     <w:multiLevelType w:val="multilevel"/>
     <w:tmpl w:val="8CBEFB58"/>
@@ -3927,34 +4484,46 @@
     </w:lvl>
   </w:abstractNum>
   <w:num w:numId="1" w16cid:durableId="1104224043">
+    <w:abstractNumId w:val="11"/>
+  </w:num>
+  <w:num w:numId="2" w16cid:durableId="102311422">
+    <w:abstractNumId w:val="9"/>
+  </w:num>
+  <w:num w:numId="3" w16cid:durableId="40982199">
+    <w:abstractNumId w:val="7"/>
+  </w:num>
+  <w:num w:numId="4" w16cid:durableId="1974214635">
+    <w:abstractNumId w:val="13"/>
+  </w:num>
+  <w:num w:numId="5" w16cid:durableId="1032076092">
+    <w:abstractNumId w:val="6"/>
+  </w:num>
+  <w:num w:numId="6" w16cid:durableId="117651708">
+    <w:abstractNumId w:val="5"/>
+  </w:num>
+  <w:num w:numId="7" w16cid:durableId="1076823469">
     <w:abstractNumId w:val="8"/>
   </w:num>
-  <w:num w:numId="2" w16cid:durableId="102311422">
-    <w:abstractNumId w:val="6"/>
+  <w:num w:numId="8" w16cid:durableId="584656264">
+    <w:abstractNumId w:val="10"/>
   </w:num>
-  <w:num w:numId="3" w16cid:durableId="40982199">
+  <w:num w:numId="9" w16cid:durableId="1313948396">
+    <w:abstractNumId w:val="3"/>
+  </w:num>
+  <w:num w:numId="10" w16cid:durableId="1386177793">
     <w:abstractNumId w:val="4"/>
   </w:num>
-  <w:num w:numId="4" w16cid:durableId="1974214635">
-    <w:abstractNumId w:val="9"/>
+  <w:num w:numId="11" w16cid:durableId="1437601332">
+    <w:abstractNumId w:val="1"/>
   </w:num>
-  <w:num w:numId="5" w16cid:durableId="1032076092">
-    <w:abstractNumId w:val="3"/>
+  <w:num w:numId="12" w16cid:durableId="166556095">
+    <w:abstractNumId w:val="12"/>
   </w:num>
-  <w:num w:numId="6" w16cid:durableId="117651708">
+  <w:num w:numId="13" w16cid:durableId="55595393">
     <w:abstractNumId w:val="2"/>
   </w:num>
-  <w:num w:numId="7" w16cid:durableId="1076823469">
-    <w:abstractNumId w:val="5"/>
-  </w:num>
-  <w:num w:numId="8" w16cid:durableId="584656264">
-    <w:abstractNumId w:val="7"/>
-  </w:num>
-  <w:num w:numId="9" w16cid:durableId="1313948396">
+  <w:num w:numId="14" w16cid:durableId="1614441922">
     <w:abstractNumId w:val="0"/>
-  </w:num>
-  <w:num w:numId="10" w16cid:durableId="1386177793">
-    <w:abstractNumId w:val="1"/>
   </w:num>
 </w:numbering>
 </file>

</xml_diff>

<commit_message>
Update README.md and HLD document with Netlify deployment links and module federation instructions
</commit_message>
<xml_diff>
--- a/Microfrontend App HLD.docx
+++ b/Microfrontend App HLD.docx
@@ -843,21 +843,7 @@
         <w:rPr>
           <w:rFonts w:ascii="Calibri" w:hAnsi="Calibri" w:cs="Calibri"/>
         </w:rPr>
-        <w:t xml:space="preserve">: Listens </w:t>
-      </w:r>
-      <w:proofErr w:type="gramStart"/>
-      <w:r>
-        <w:rPr>
-          <w:rFonts w:ascii="Calibri" w:hAnsi="Calibri" w:cs="Calibri"/>
-        </w:rPr>
-        <w:t>for</w:t>
-      </w:r>
-      <w:proofErr w:type="gramEnd"/>
-      <w:r>
-        <w:rPr>
-          <w:rFonts w:ascii="Calibri" w:hAnsi="Calibri" w:cs="Calibri"/>
-        </w:rPr>
-        <w:t xml:space="preserve"> any events (such as "Send Message") from the Container App and shows relevant messages.</w:t>
+        <w:t>: Listens for any events (such as "Send Message") from the Container App and shows relevant messages.</w:t>
       </w:r>
     </w:p>
     <w:p>
@@ -1087,21 +1073,7 @@
         <w:rPr>
           <w:rFonts w:ascii="Calibri" w:hAnsi="Calibri" w:cs="Calibri"/>
         </w:rPr>
-        <w:t xml:space="preserve">: Listens </w:t>
-      </w:r>
-      <w:proofErr w:type="gramStart"/>
-      <w:r>
-        <w:rPr>
-          <w:rFonts w:ascii="Calibri" w:hAnsi="Calibri" w:cs="Calibri"/>
-        </w:rPr>
-        <w:t>for</w:t>
-      </w:r>
-      <w:proofErr w:type="gramEnd"/>
-      <w:r>
-        <w:rPr>
-          <w:rFonts w:ascii="Calibri" w:hAnsi="Calibri" w:cs="Calibri"/>
-        </w:rPr>
-        <w:t xml:space="preserve"> events from the Container App to show notifications.</w:t>
+        <w:t>: Listens for events from the Container App to show notifications.</w:t>
       </w:r>
     </w:p>
     <w:p>
@@ -1574,21 +1546,7 @@
         <w:rPr>
           <w:rFonts w:ascii="Calibri" w:hAnsi="Calibri" w:cs="Calibri"/>
         </w:rPr>
-        <w:t>: Each micro-</w:t>
-      </w:r>
-      <w:proofErr w:type="gramStart"/>
-      <w:r>
-        <w:rPr>
-          <w:rFonts w:ascii="Calibri" w:hAnsi="Calibri" w:cs="Calibri"/>
-        </w:rPr>
-        <w:t>frontend</w:t>
-      </w:r>
-      <w:proofErr w:type="gramEnd"/>
-      <w:r>
-        <w:rPr>
-          <w:rFonts w:ascii="Calibri" w:hAnsi="Calibri" w:cs="Calibri"/>
-        </w:rPr>
-        <w:t xml:space="preserve"> (Container, Users, and Insurance) runs on separate ports (3000, 3001, 3002). </w:t>
+        <w:t xml:space="preserve">: Each micro-frontend (Container, Users, and Insurance) runs on separate ports (3000, 3001, 3002). </w:t>
       </w:r>
     </w:p>
     <w:p>
@@ -2266,6 +2224,181 @@
       <w:pPr>
         <w:rPr>
           <w:rFonts w:ascii="Calibri" w:hAnsi="Calibri" w:cs="Calibri"/>
+        </w:rPr>
+      </w:pPr>
+    </w:p>
+    <w:p>
+      <w:pPr>
+        <w:rPr>
+          <w:rFonts w:ascii="Calibri" w:hAnsi="Calibri" w:cs="Calibri"/>
+          <w:b/>
+          <w:bCs/>
+          <w:lang w:val="en-IN"/>
+        </w:rPr>
+      </w:pPr>
+      <w:r>
+        <w:rPr>
+          <w:rFonts w:ascii="Calibri" w:hAnsi="Calibri" w:cs="Calibri"/>
+          <w:b/>
+          <w:bCs/>
+          <w:lang w:val="en-IN"/>
+        </w:rPr>
+        <w:t>8. Remote Deployment Links (Netlify)</w:t>
+      </w:r>
+    </w:p>
+    <w:p>
+      <w:pPr>
+        <w:pStyle w:val="ListParagraph"/>
+        <w:numPr>
+          <w:ilvl w:val="0"/>
+          <w:numId w:val="14"/>
+        </w:numPr>
+        <w:rPr>
+          <w:rFonts w:ascii="Calibri" w:hAnsi="Calibri" w:cs="Calibri"/>
+          <w:b/>
+          <w:bCs/>
+          <w:lang w:val="en-IN"/>
+        </w:rPr>
+      </w:pPr>
+      <w:r>
+        <w:rPr>
+          <w:rFonts w:ascii="Calibri" w:hAnsi="Calibri" w:cs="Calibri"/>
+          <w:b/>
+          <w:bCs/>
+          <w:lang w:val="en-IN"/>
+        </w:rPr>
+        <w:t xml:space="preserve">Container (main app): </w:t>
+      </w:r>
+      <w:hyperlink r:id="rId7" w:history="1">
+        <w:r>
+          <w:rPr>
+            <w:rStyle w:val="Hyperlink"/>
+            <w:rFonts w:ascii="Calibri" w:hAnsi="Calibri" w:cs="Calibri"/>
+            <w:b/>
+            <w:bCs/>
+            <w:lang w:val="en-IN"/>
+          </w:rPr>
+          <w:t>https://nagp-akansh-container.netlify.app/</w:t>
+        </w:r>
+      </w:hyperlink>
+    </w:p>
+    <w:p>
+      <w:pPr>
+        <w:rPr>
+          <w:rFonts w:ascii="Calibri" w:hAnsi="Calibri" w:cs="Calibri"/>
+          <w:b/>
+          <w:bCs/>
+          <w:lang w:val="en-IN"/>
+        </w:rPr>
+      </w:pPr>
+    </w:p>
+    <w:p>
+      <w:pPr>
+        <w:pStyle w:val="ListParagraph"/>
+        <w:numPr>
+          <w:ilvl w:val="0"/>
+          <w:numId w:val="13"/>
+        </w:numPr>
+        <w:rPr>
+          <w:rFonts w:ascii="Calibri" w:hAnsi="Calibri" w:cs="Calibri"/>
+          <w:b/>
+          <w:bCs/>
+          <w:lang w:val="en-IN"/>
+        </w:rPr>
+      </w:pPr>
+      <w:r>
+        <w:rPr>
+          <w:rFonts w:ascii="Calibri" w:hAnsi="Calibri" w:cs="Calibri"/>
+          <w:b/>
+          <w:bCs/>
+          <w:lang w:val="en-IN"/>
+        </w:rPr>
+        <w:t>Users</w:t>
+      </w:r>
+      <w:r>
+        <w:rPr>
+          <w:rFonts w:ascii="Calibri" w:hAnsi="Calibri" w:cs="Calibri"/>
+          <w:b/>
+          <w:bCs/>
+          <w:lang w:val="en-IN"/>
+        </w:rPr>
+        <w:t xml:space="preserve"> micro-frontend: </w:t>
+      </w:r>
+      <w:hyperlink r:id="rId8" w:history="1">
+        <w:r>
+          <w:rPr>
+            <w:rStyle w:val="Hyperlink"/>
+            <w:rFonts w:ascii="Calibri" w:hAnsi="Calibri" w:cs="Calibri"/>
+            <w:b/>
+            <w:bCs/>
+            <w:lang w:val="en-IN"/>
+          </w:rPr>
+          <w:t>https://nagp-akansh-user.netlify.app/</w:t>
+        </w:r>
+      </w:hyperlink>
+    </w:p>
+    <w:p>
+      <w:pPr>
+        <w:rPr>
+          <w:rFonts w:ascii="Calibri" w:hAnsi="Calibri" w:cs="Calibri"/>
+          <w:b/>
+          <w:bCs/>
+          <w:lang w:val="en-IN"/>
+        </w:rPr>
+      </w:pPr>
+    </w:p>
+    <w:p>
+      <w:pPr>
+        <w:pStyle w:val="ListParagraph"/>
+        <w:numPr>
+          <w:ilvl w:val="0"/>
+          <w:numId w:val="7"/>
+        </w:numPr>
+        <w:rPr>
+          <w:rFonts w:ascii="Calibri" w:hAnsi="Calibri" w:cs="Calibri"/>
+          <w:b/>
+          <w:bCs/>
+          <w:lang w:val="pt-PT"/>
+        </w:rPr>
+      </w:pPr>
+      <w:r>
+        <w:rPr>
+          <w:rFonts w:ascii="Calibri" w:hAnsi="Calibri" w:cs="Calibri"/>
+          <w:b/>
+          <w:bCs/>
+          <w:lang w:val="pt-PT"/>
+        </w:rPr>
+        <w:t xml:space="preserve">Insurance micro-frontend: </w:t>
+      </w:r>
+      <w:hyperlink r:id="rId9" w:history="1">
+        <w:r>
+          <w:rPr>
+            <w:rStyle w:val="Hyperlink"/>
+            <w:rFonts w:ascii="Calibri" w:hAnsi="Calibri" w:cs="Calibri"/>
+            <w:b/>
+            <w:bCs/>
+            <w:lang w:val="pt-PT"/>
+          </w:rPr>
+          <w:t>https://nagp-akansh-insurance.netlify.app/</w:t>
+        </w:r>
+      </w:hyperlink>
+    </w:p>
+    <w:p>
+      <w:pPr>
+        <w:ind w:left="360"/>
+        <w:rPr>
+          <w:rFonts w:ascii="Calibri" w:hAnsi="Calibri" w:cs="Calibri"/>
+          <w:b/>
+          <w:bCs/>
+          <w:lang w:val="pt-PT"/>
+        </w:rPr>
+      </w:pPr>
+    </w:p>
+    <w:p>
+      <w:pPr>
+        <w:rPr>
+          <w:rFonts w:ascii="Calibri" w:hAnsi="Calibri" w:cs="Calibri"/>
+          <w:lang w:val="pt-PT"/>
         </w:rPr>
       </w:pPr>
     </w:p>
@@ -2573,6 +2706,318 @@
 <file path=word/numbering.xml><?xml version="1.0" encoding="utf-8"?>
 <w:numbering xmlns:wpc="http://schemas.microsoft.com/office/word/2010/wordprocessingCanvas" xmlns:cx="http://schemas.microsoft.com/office/drawing/2014/chartex" xmlns:cx1="http://schemas.microsoft.com/office/drawing/2015/9/8/chartex" xmlns:cx2="http://schemas.microsoft.com/office/drawing/2015/10/21/chartex" xmlns:cx3="http://schemas.microsoft.com/office/drawing/2016/5/9/chartex" xmlns:cx4="http://schemas.microsoft.com/office/drawing/2016/5/10/chartex" xmlns:cx5="http://schemas.microsoft.com/office/drawing/2016/5/11/chartex" xmlns:cx6="http://schemas.microsoft.com/office/drawing/2016/5/12/chartex" xmlns:cx7="http://schemas.microsoft.com/office/drawing/2016/5/13/chartex" xmlns:cx8="http://schemas.microsoft.com/office/drawing/2016/5/14/chartex" xmlns:mc="http://schemas.openxmlformats.org/markup-compatibility/2006" xmlns:aink="http://schemas.microsoft.com/office/drawing/2016/ink" xmlns:am3d="http://schemas.microsoft.com/office/drawing/2017/model3d" xmlns:o="urn:schemas-microsoft-com:office:office" xmlns:oel="http://schemas.microsoft.com/office/2019/extlst" xmlns:r="http://schemas.openxmlformats.org/officeDocument/2006/relationships" xmlns:m="http://schemas.openxmlformats.org/officeDocument/2006/math" xmlns:v="urn:schemas-microsoft-com:vml" xmlns:wp14="http://schemas.microsoft.com/office/word/2010/wordprocessingDrawing" xmlns:wp="http://schemas.openxmlformats.org/drawingml/2006/wordprocessingDrawing" xmlns:w10="urn:schemas-microsoft-com:office:word" xmlns:w="http://schemas.openxmlformats.org/wordprocessingml/2006/main" xmlns:w14="http://schemas.microsoft.com/office/word/2010/wordml" xmlns:w15="http://schemas.microsoft.com/office/word/2012/wordml" xmlns:w16cex="http://schemas.microsoft.com/office/word/2018/wordml/cex" xmlns:w16cid="http://schemas.microsoft.com/office/word/2016/wordml/cid" xmlns:w16="http://schemas.microsoft.com/office/word/2018/wordml" xmlns:w16du="http://schemas.microsoft.com/office/word/2023/wordml/word16du" xmlns:w16sdtdh="http://schemas.microsoft.com/office/word/2020/wordml/sdtdatahash" xmlns:w16sdtfl="http://schemas.microsoft.com/office/word/2024/wordml/sdtformatlock" xmlns:w16se="http://schemas.microsoft.com/office/word/2015/wordml/symex" xmlns:wpg="http://schemas.microsoft.com/office/word/2010/wordprocessingGroup" xmlns:wpi="http://schemas.microsoft.com/office/word/2010/wordprocessingInk" xmlns:wne="http://schemas.microsoft.com/office/word/2006/wordml" xmlns:wps="http://schemas.microsoft.com/office/word/2010/wordprocessingShape" mc:Ignorable="w14 w15 w16se w16cid w16 w16cex w16sdtdh w16sdtfl w16du wp14">
   <w:abstractNum w:abstractNumId="0" w15:restartNumberingAfterBreak="0">
+    <w:nsid w:val="068142BE"/>
+    <w:multiLevelType w:val="hybridMultilevel"/>
+    <w:tmpl w:val="5DBA3B04"/>
+    <w:lvl w:ilvl="0" w:tplc="4009000B">
+      <w:start w:val="1"/>
+      <w:numFmt w:val="bullet"/>
+      <w:lvlText w:val=""/>
+      <w:lvlJc w:val="left"/>
+      <w:pPr>
+        <w:ind w:left="720" w:hanging="360"/>
+      </w:pPr>
+      <w:rPr>
+        <w:rFonts w:ascii="Wingdings" w:hAnsi="Wingdings" w:hint="default"/>
+      </w:rPr>
+    </w:lvl>
+    <w:lvl w:ilvl="1" w:tplc="40090003" w:tentative="1">
+      <w:start w:val="1"/>
+      <w:numFmt w:val="bullet"/>
+      <w:lvlText w:val="o"/>
+      <w:lvlJc w:val="left"/>
+      <w:pPr>
+        <w:ind w:left="1440" w:hanging="360"/>
+      </w:pPr>
+      <w:rPr>
+        <w:rFonts w:ascii="Courier New" w:hAnsi="Courier New" w:cs="Courier New" w:hint="default"/>
+      </w:rPr>
+    </w:lvl>
+    <w:lvl w:ilvl="2" w:tplc="40090005" w:tentative="1">
+      <w:start w:val="1"/>
+      <w:numFmt w:val="bullet"/>
+      <w:lvlText w:val=""/>
+      <w:lvlJc w:val="left"/>
+      <w:pPr>
+        <w:ind w:left="2160" w:hanging="360"/>
+      </w:pPr>
+      <w:rPr>
+        <w:rFonts w:ascii="Wingdings" w:hAnsi="Wingdings" w:hint="default"/>
+      </w:rPr>
+    </w:lvl>
+    <w:lvl w:ilvl="3" w:tplc="40090001" w:tentative="1">
+      <w:start w:val="1"/>
+      <w:numFmt w:val="bullet"/>
+      <w:lvlText w:val=""/>
+      <w:lvlJc w:val="left"/>
+      <w:pPr>
+        <w:ind w:left="2880" w:hanging="360"/>
+      </w:pPr>
+      <w:rPr>
+        <w:rFonts w:ascii="Symbol" w:hAnsi="Symbol" w:hint="default"/>
+      </w:rPr>
+    </w:lvl>
+    <w:lvl w:ilvl="4" w:tplc="40090003" w:tentative="1">
+      <w:start w:val="1"/>
+      <w:numFmt w:val="bullet"/>
+      <w:lvlText w:val="o"/>
+      <w:lvlJc w:val="left"/>
+      <w:pPr>
+        <w:ind w:left="3600" w:hanging="360"/>
+      </w:pPr>
+      <w:rPr>
+        <w:rFonts w:ascii="Courier New" w:hAnsi="Courier New" w:cs="Courier New" w:hint="default"/>
+      </w:rPr>
+    </w:lvl>
+    <w:lvl w:ilvl="5" w:tplc="40090005" w:tentative="1">
+      <w:start w:val="1"/>
+      <w:numFmt w:val="bullet"/>
+      <w:lvlText w:val=""/>
+      <w:lvlJc w:val="left"/>
+      <w:pPr>
+        <w:ind w:left="4320" w:hanging="360"/>
+      </w:pPr>
+      <w:rPr>
+        <w:rFonts w:ascii="Wingdings" w:hAnsi="Wingdings" w:hint="default"/>
+      </w:rPr>
+    </w:lvl>
+    <w:lvl w:ilvl="6" w:tplc="40090001" w:tentative="1">
+      <w:start w:val="1"/>
+      <w:numFmt w:val="bullet"/>
+      <w:lvlText w:val=""/>
+      <w:lvlJc w:val="left"/>
+      <w:pPr>
+        <w:ind w:left="5040" w:hanging="360"/>
+      </w:pPr>
+      <w:rPr>
+        <w:rFonts w:ascii="Symbol" w:hAnsi="Symbol" w:hint="default"/>
+      </w:rPr>
+    </w:lvl>
+    <w:lvl w:ilvl="7" w:tplc="40090003" w:tentative="1">
+      <w:start w:val="1"/>
+      <w:numFmt w:val="bullet"/>
+      <w:lvlText w:val="o"/>
+      <w:lvlJc w:val="left"/>
+      <w:pPr>
+        <w:ind w:left="5760" w:hanging="360"/>
+      </w:pPr>
+      <w:rPr>
+        <w:rFonts w:ascii="Courier New" w:hAnsi="Courier New" w:cs="Courier New" w:hint="default"/>
+      </w:rPr>
+    </w:lvl>
+    <w:lvl w:ilvl="8" w:tplc="40090005" w:tentative="1">
+      <w:start w:val="1"/>
+      <w:numFmt w:val="bullet"/>
+      <w:lvlText w:val=""/>
+      <w:lvlJc w:val="left"/>
+      <w:pPr>
+        <w:ind w:left="6480" w:hanging="360"/>
+      </w:pPr>
+      <w:rPr>
+        <w:rFonts w:ascii="Wingdings" w:hAnsi="Wingdings" w:hint="default"/>
+      </w:rPr>
+    </w:lvl>
+  </w:abstractNum>
+  <w:abstractNum w:abstractNumId="1" w15:restartNumberingAfterBreak="0">
+    <w:nsid w:val="0C055744"/>
+    <w:multiLevelType w:val="hybridMultilevel"/>
+    <w:tmpl w:val="03DC60A4"/>
+    <w:lvl w:ilvl="0" w:tplc="4009000F">
+      <w:start w:val="1"/>
+      <w:numFmt w:val="decimal"/>
+      <w:lvlText w:val="%1."/>
+      <w:lvlJc w:val="left"/>
+      <w:pPr>
+        <w:ind w:left="990" w:hanging="360"/>
+      </w:pPr>
+    </w:lvl>
+    <w:lvl w:ilvl="1" w:tplc="40090019" w:tentative="1">
+      <w:start w:val="1"/>
+      <w:numFmt w:val="lowerLetter"/>
+      <w:lvlText w:val="%2."/>
+      <w:lvlJc w:val="left"/>
+      <w:pPr>
+        <w:ind w:left="1710" w:hanging="360"/>
+      </w:pPr>
+    </w:lvl>
+    <w:lvl w:ilvl="2" w:tplc="4009001B" w:tentative="1">
+      <w:start w:val="1"/>
+      <w:numFmt w:val="lowerRoman"/>
+      <w:lvlText w:val="%3."/>
+      <w:lvlJc w:val="right"/>
+      <w:pPr>
+        <w:ind w:left="2430" w:hanging="180"/>
+      </w:pPr>
+    </w:lvl>
+    <w:lvl w:ilvl="3" w:tplc="4009000F" w:tentative="1">
+      <w:start w:val="1"/>
+      <w:numFmt w:val="decimal"/>
+      <w:lvlText w:val="%4."/>
+      <w:lvlJc w:val="left"/>
+      <w:pPr>
+        <w:ind w:left="3150" w:hanging="360"/>
+      </w:pPr>
+    </w:lvl>
+    <w:lvl w:ilvl="4" w:tplc="40090019" w:tentative="1">
+      <w:start w:val="1"/>
+      <w:numFmt w:val="lowerLetter"/>
+      <w:lvlText w:val="%5."/>
+      <w:lvlJc w:val="left"/>
+      <w:pPr>
+        <w:ind w:left="3870" w:hanging="360"/>
+      </w:pPr>
+    </w:lvl>
+    <w:lvl w:ilvl="5" w:tplc="4009001B" w:tentative="1">
+      <w:start w:val="1"/>
+      <w:numFmt w:val="lowerRoman"/>
+      <w:lvlText w:val="%6."/>
+      <w:lvlJc w:val="right"/>
+      <w:pPr>
+        <w:ind w:left="4590" w:hanging="180"/>
+      </w:pPr>
+    </w:lvl>
+    <w:lvl w:ilvl="6" w:tplc="4009000F" w:tentative="1">
+      <w:start w:val="1"/>
+      <w:numFmt w:val="decimal"/>
+      <w:lvlText w:val="%7."/>
+      <w:lvlJc w:val="left"/>
+      <w:pPr>
+        <w:ind w:left="5310" w:hanging="360"/>
+      </w:pPr>
+    </w:lvl>
+    <w:lvl w:ilvl="7" w:tplc="40090019" w:tentative="1">
+      <w:start w:val="1"/>
+      <w:numFmt w:val="lowerLetter"/>
+      <w:lvlText w:val="%8."/>
+      <w:lvlJc w:val="left"/>
+      <w:pPr>
+        <w:ind w:left="6030" w:hanging="360"/>
+      </w:pPr>
+    </w:lvl>
+    <w:lvl w:ilvl="8" w:tplc="4009001B" w:tentative="1">
+      <w:start w:val="1"/>
+      <w:numFmt w:val="lowerRoman"/>
+      <w:lvlText w:val="%9."/>
+      <w:lvlJc w:val="right"/>
+      <w:pPr>
+        <w:ind w:left="6750" w:hanging="180"/>
+      </w:pPr>
+    </w:lvl>
+  </w:abstractNum>
+  <w:abstractNum w:abstractNumId="2" w15:restartNumberingAfterBreak="0">
+    <w:nsid w:val="16283456"/>
+    <w:multiLevelType w:val="hybridMultilevel"/>
+    <w:tmpl w:val="1EA02C28"/>
+    <w:lvl w:ilvl="0" w:tplc="4009000B">
+      <w:start w:val="1"/>
+      <w:numFmt w:val="bullet"/>
+      <w:lvlText w:val=""/>
+      <w:lvlJc w:val="left"/>
+      <w:pPr>
+        <w:ind w:left="720" w:hanging="360"/>
+      </w:pPr>
+      <w:rPr>
+        <w:rFonts w:ascii="Wingdings" w:hAnsi="Wingdings" w:hint="default"/>
+      </w:rPr>
+    </w:lvl>
+    <w:lvl w:ilvl="1" w:tplc="40090003" w:tentative="1">
+      <w:start w:val="1"/>
+      <w:numFmt w:val="bullet"/>
+      <w:lvlText w:val="o"/>
+      <w:lvlJc w:val="left"/>
+      <w:pPr>
+        <w:ind w:left="1440" w:hanging="360"/>
+      </w:pPr>
+      <w:rPr>
+        <w:rFonts w:ascii="Courier New" w:hAnsi="Courier New" w:cs="Courier New" w:hint="default"/>
+      </w:rPr>
+    </w:lvl>
+    <w:lvl w:ilvl="2" w:tplc="40090005" w:tentative="1">
+      <w:start w:val="1"/>
+      <w:numFmt w:val="bullet"/>
+      <w:lvlText w:val=""/>
+      <w:lvlJc w:val="left"/>
+      <w:pPr>
+        <w:ind w:left="2160" w:hanging="360"/>
+      </w:pPr>
+      <w:rPr>
+        <w:rFonts w:ascii="Wingdings" w:hAnsi="Wingdings" w:hint="default"/>
+      </w:rPr>
+    </w:lvl>
+    <w:lvl w:ilvl="3" w:tplc="40090001" w:tentative="1">
+      <w:start w:val="1"/>
+      <w:numFmt w:val="bullet"/>
+      <w:lvlText w:val=""/>
+      <w:lvlJc w:val="left"/>
+      <w:pPr>
+        <w:ind w:left="2880" w:hanging="360"/>
+      </w:pPr>
+      <w:rPr>
+        <w:rFonts w:ascii="Symbol" w:hAnsi="Symbol" w:hint="default"/>
+      </w:rPr>
+    </w:lvl>
+    <w:lvl w:ilvl="4" w:tplc="40090003" w:tentative="1">
+      <w:start w:val="1"/>
+      <w:numFmt w:val="bullet"/>
+      <w:lvlText w:val="o"/>
+      <w:lvlJc w:val="left"/>
+      <w:pPr>
+        <w:ind w:left="3600" w:hanging="360"/>
+      </w:pPr>
+      <w:rPr>
+        <w:rFonts w:ascii="Courier New" w:hAnsi="Courier New" w:cs="Courier New" w:hint="default"/>
+      </w:rPr>
+    </w:lvl>
+    <w:lvl w:ilvl="5" w:tplc="40090005" w:tentative="1">
+      <w:start w:val="1"/>
+      <w:numFmt w:val="bullet"/>
+      <w:lvlText w:val=""/>
+      <w:lvlJc w:val="left"/>
+      <w:pPr>
+        <w:ind w:left="4320" w:hanging="360"/>
+      </w:pPr>
+      <w:rPr>
+        <w:rFonts w:ascii="Wingdings" w:hAnsi="Wingdings" w:hint="default"/>
+      </w:rPr>
+    </w:lvl>
+    <w:lvl w:ilvl="6" w:tplc="40090001" w:tentative="1">
+      <w:start w:val="1"/>
+      <w:numFmt w:val="bullet"/>
+      <w:lvlText w:val=""/>
+      <w:lvlJc w:val="left"/>
+      <w:pPr>
+        <w:ind w:left="5040" w:hanging="360"/>
+      </w:pPr>
+      <w:rPr>
+        <w:rFonts w:ascii="Symbol" w:hAnsi="Symbol" w:hint="default"/>
+      </w:rPr>
+    </w:lvl>
+    <w:lvl w:ilvl="7" w:tplc="40090003" w:tentative="1">
+      <w:start w:val="1"/>
+      <w:numFmt w:val="bullet"/>
+      <w:lvlText w:val="o"/>
+      <w:lvlJc w:val="left"/>
+      <w:pPr>
+        <w:ind w:left="5760" w:hanging="360"/>
+      </w:pPr>
+      <w:rPr>
+        <w:rFonts w:ascii="Courier New" w:hAnsi="Courier New" w:cs="Courier New" w:hint="default"/>
+      </w:rPr>
+    </w:lvl>
+    <w:lvl w:ilvl="8" w:tplc="40090005" w:tentative="1">
+      <w:start w:val="1"/>
+      <w:numFmt w:val="bullet"/>
+      <w:lvlText w:val=""/>
+      <w:lvlJc w:val="left"/>
+      <w:pPr>
+        <w:ind w:left="6480" w:hanging="360"/>
+      </w:pPr>
+      <w:rPr>
+        <w:rFonts w:ascii="Wingdings" w:hAnsi="Wingdings" w:hint="default"/>
+      </w:rPr>
+    </w:lvl>
+  </w:abstractNum>
+  <w:abstractNum w:abstractNumId="3" w15:restartNumberingAfterBreak="0">
     <w:nsid w:val="188270F6"/>
     <w:multiLevelType w:val="multilevel"/>
     <w:tmpl w:val="9C3E7D7C"/>
@@ -2689,7 +3134,7 @@
       </w:pPr>
     </w:lvl>
   </w:abstractNum>
-  <w:abstractNum w:abstractNumId="1" w15:restartNumberingAfterBreak="0">
+  <w:abstractNum w:abstractNumId="4" w15:restartNumberingAfterBreak="0">
     <w:nsid w:val="23BD364E"/>
     <w:multiLevelType w:val="hybridMultilevel"/>
     <w:tmpl w:val="FD380B9E"/>
@@ -2802,7 +3247,7 @@
       </w:rPr>
     </w:lvl>
   </w:abstractNum>
-  <w:abstractNum w:abstractNumId="2" w15:restartNumberingAfterBreak="0">
+  <w:abstractNum w:abstractNumId="5" w15:restartNumberingAfterBreak="0">
     <w:nsid w:val="2A844D09"/>
     <w:multiLevelType w:val="multilevel"/>
     <w:tmpl w:val="38E0321E"/>
@@ -2951,7 +3396,7 @@
       </w:rPr>
     </w:lvl>
   </w:abstractNum>
-  <w:abstractNum w:abstractNumId="3" w15:restartNumberingAfterBreak="0">
+  <w:abstractNum w:abstractNumId="6" w15:restartNumberingAfterBreak="0">
     <w:nsid w:val="394B1EE6"/>
     <w:multiLevelType w:val="multilevel"/>
     <w:tmpl w:val="04D83F22"/>
@@ -3100,10 +3545,10 @@
       </w:rPr>
     </w:lvl>
   </w:abstractNum>
-  <w:abstractNum w:abstractNumId="4" w15:restartNumberingAfterBreak="0">
+  <w:abstractNum w:abstractNumId="7" w15:restartNumberingAfterBreak="0">
     <w:nsid w:val="3B3223AB"/>
     <w:multiLevelType w:val="multilevel"/>
-    <w:tmpl w:val="07C43516"/>
+    <w:tmpl w:val="8266FAB6"/>
     <w:lvl w:ilvl="0">
       <w:start w:val="1"/>
       <w:numFmt w:val="bullet"/>
@@ -3136,127 +3581,123 @@
         <w:sz w:val="20"/>
       </w:rPr>
     </w:lvl>
-    <w:lvl w:ilvl="2" w:tentative="1">
+    <w:lvl w:ilvl="2">
+      <w:start w:val="1"/>
+      <w:numFmt w:val="decimal"/>
+      <w:lvlText w:val="%3."/>
+      <w:lvlJc w:val="left"/>
+      <w:pPr>
+        <w:ind w:left="2160" w:hanging="360"/>
+      </w:pPr>
+      <w:rPr>
+        <w:rFonts w:hint="default"/>
+      </w:rPr>
+    </w:lvl>
+    <w:lvl w:ilvl="3" w:tentative="1">
       <w:start w:val="1"/>
       <w:numFmt w:val="bullet"/>
       <w:lvlText w:val=""/>
       <w:lvlJc w:val="left"/>
       <w:pPr>
         <w:tabs>
-          <w:tab w:val="num" w:pos="2160"/>
-        </w:tabs>
-        <w:ind w:left="2160" w:hanging="360"/>
+          <w:tab w:val="num" w:pos="2880"/>
+        </w:tabs>
+        <w:ind w:left="2880" w:hanging="360"/>
       </w:pPr>
       <w:rPr>
         <w:rFonts w:ascii="Wingdings" w:hAnsi="Wingdings" w:hint="default"/>
         <w:sz w:val="20"/>
       </w:rPr>
     </w:lvl>
-    <w:lvl w:ilvl="3" w:tentative="1">
+    <w:lvl w:ilvl="4" w:tentative="1">
       <w:start w:val="1"/>
       <w:numFmt w:val="bullet"/>
       <w:lvlText w:val=""/>
       <w:lvlJc w:val="left"/>
       <w:pPr>
         <w:tabs>
-          <w:tab w:val="num" w:pos="2880"/>
-        </w:tabs>
-        <w:ind w:left="2880" w:hanging="360"/>
+          <w:tab w:val="num" w:pos="3600"/>
+        </w:tabs>
+        <w:ind w:left="3600" w:hanging="360"/>
       </w:pPr>
       <w:rPr>
         <w:rFonts w:ascii="Wingdings" w:hAnsi="Wingdings" w:hint="default"/>
         <w:sz w:val="20"/>
       </w:rPr>
     </w:lvl>
-    <w:lvl w:ilvl="4" w:tentative="1">
+    <w:lvl w:ilvl="5" w:tentative="1">
       <w:start w:val="1"/>
       <w:numFmt w:val="bullet"/>
       <w:lvlText w:val=""/>
       <w:lvlJc w:val="left"/>
       <w:pPr>
         <w:tabs>
-          <w:tab w:val="num" w:pos="3600"/>
-        </w:tabs>
-        <w:ind w:left="3600" w:hanging="360"/>
+          <w:tab w:val="num" w:pos="4320"/>
+        </w:tabs>
+        <w:ind w:left="4320" w:hanging="360"/>
       </w:pPr>
       <w:rPr>
         <w:rFonts w:ascii="Wingdings" w:hAnsi="Wingdings" w:hint="default"/>
         <w:sz w:val="20"/>
       </w:rPr>
     </w:lvl>
-    <w:lvl w:ilvl="5" w:tentative="1">
+    <w:lvl w:ilvl="6" w:tentative="1">
       <w:start w:val="1"/>
       <w:numFmt w:val="bullet"/>
       <w:lvlText w:val=""/>
       <w:lvlJc w:val="left"/>
       <w:pPr>
         <w:tabs>
-          <w:tab w:val="num" w:pos="4320"/>
-        </w:tabs>
-        <w:ind w:left="4320" w:hanging="360"/>
+          <w:tab w:val="num" w:pos="5040"/>
+        </w:tabs>
+        <w:ind w:left="5040" w:hanging="360"/>
       </w:pPr>
       <w:rPr>
         <w:rFonts w:ascii="Wingdings" w:hAnsi="Wingdings" w:hint="default"/>
         <w:sz w:val="20"/>
       </w:rPr>
     </w:lvl>
-    <w:lvl w:ilvl="6" w:tentative="1">
+    <w:lvl w:ilvl="7" w:tentative="1">
       <w:start w:val="1"/>
       <w:numFmt w:val="bullet"/>
       <w:lvlText w:val=""/>
       <w:lvlJc w:val="left"/>
       <w:pPr>
         <w:tabs>
-          <w:tab w:val="num" w:pos="5040"/>
-        </w:tabs>
-        <w:ind w:left="5040" w:hanging="360"/>
+          <w:tab w:val="num" w:pos="5760"/>
+        </w:tabs>
+        <w:ind w:left="5760" w:hanging="360"/>
       </w:pPr>
       <w:rPr>
         <w:rFonts w:ascii="Wingdings" w:hAnsi="Wingdings" w:hint="default"/>
         <w:sz w:val="20"/>
       </w:rPr>
     </w:lvl>
-    <w:lvl w:ilvl="7" w:tentative="1">
+    <w:lvl w:ilvl="8" w:tentative="1">
       <w:start w:val="1"/>
       <w:numFmt w:val="bullet"/>
       <w:lvlText w:val=""/>
       <w:lvlJc w:val="left"/>
       <w:pPr>
         <w:tabs>
-          <w:tab w:val="num" w:pos="5760"/>
-        </w:tabs>
-        <w:ind w:left="5760" w:hanging="360"/>
+          <w:tab w:val="num" w:pos="6480"/>
+        </w:tabs>
+        <w:ind w:left="6480" w:hanging="360"/>
       </w:pPr>
       <w:rPr>
         <w:rFonts w:ascii="Wingdings" w:hAnsi="Wingdings" w:hint="default"/>
         <w:sz w:val="20"/>
       </w:rPr>
     </w:lvl>
-    <w:lvl w:ilvl="8" w:tentative="1">
-      <w:start w:val="1"/>
-      <w:numFmt w:val="bullet"/>
-      <w:lvlText w:val=""/>
-      <w:lvlJc w:val="left"/>
-      <w:pPr>
-        <w:tabs>
-          <w:tab w:val="num" w:pos="6480"/>
-        </w:tabs>
-        <w:ind w:left="6480" w:hanging="360"/>
-      </w:pPr>
-      <w:rPr>
-        <w:rFonts w:ascii="Wingdings" w:hAnsi="Wingdings" w:hint="default"/>
-        <w:sz w:val="20"/>
-      </w:rPr>
-    </w:lvl>
   </w:abstractNum>
-  <w:abstractNum w:abstractNumId="5" w15:restartNumberingAfterBreak="0">
+  <w:abstractNum w:abstractNumId="8" w15:restartNumberingAfterBreak="0">
     <w:nsid w:val="4B496248"/>
     <w:multiLevelType w:val="multilevel"/>
-    <w:tmpl w:val="754EBF68"/>
+    <w:tmpl w:val="3FE2312A"/>
     <w:lvl w:ilvl="0">
       <w:start w:val="1"/>
-      <w:numFmt w:val="decimal"/>
-      <w:lvlText w:val="%1."/>
+      <w:numFmt w:val="bullet"/>
+      <w:lvlText w:val=""/>
       <w:lvlJc w:val="left"/>
       <w:pPr>
         <w:tabs>
@@ -3264,6 +3705,9 @@
         </w:tabs>
         <w:ind w:left="720" w:hanging="360"/>
       </w:pPr>
+      <w:rPr>
+        <w:rFonts w:ascii="Wingdings" w:hAnsi="Wingdings" w:hint="default"/>
+      </w:rPr>
     </w:lvl>
     <w:lvl w:ilvl="1">
       <w:start w:val="1"/>
@@ -3366,7 +3810,7 @@
       </w:pPr>
     </w:lvl>
   </w:abstractNum>
-  <w:abstractNum w:abstractNumId="6" w15:restartNumberingAfterBreak="0">
+  <w:abstractNum w:abstractNumId="9" w15:restartNumberingAfterBreak="0">
     <w:nsid w:val="60B00422"/>
     <w:multiLevelType w:val="multilevel"/>
     <w:tmpl w:val="8496F0DE"/>
@@ -3515,7 +3959,7 @@
       </w:rPr>
     </w:lvl>
   </w:abstractNum>
-  <w:abstractNum w:abstractNumId="7" w15:restartNumberingAfterBreak="0">
+  <w:abstractNum w:abstractNumId="10" w15:restartNumberingAfterBreak="0">
     <w:nsid w:val="69AA7320"/>
     <w:multiLevelType w:val="multilevel"/>
     <w:tmpl w:val="B66CE5E6"/>
@@ -3664,7 +4108,7 @@
       </w:rPr>
     </w:lvl>
   </w:abstractNum>
-  <w:abstractNum w:abstractNumId="8" w15:restartNumberingAfterBreak="0">
+  <w:abstractNum w:abstractNumId="11" w15:restartNumberingAfterBreak="0">
     <w:nsid w:val="6B461C3B"/>
     <w:multiLevelType w:val="multilevel"/>
     <w:tmpl w:val="777AF396"/>
@@ -3777,7 +4221,120 @@
       </w:pPr>
     </w:lvl>
   </w:abstractNum>
-  <w:abstractNum w:abstractNumId="9" w15:restartNumberingAfterBreak="0">
+  <w:abstractNum w:abstractNumId="12" w15:restartNumberingAfterBreak="0">
+    <w:nsid w:val="6F4E401E"/>
+    <w:multiLevelType w:val="hybridMultilevel"/>
+    <w:tmpl w:val="240EB926"/>
+    <w:lvl w:ilvl="0" w:tplc="4009000B">
+      <w:start w:val="1"/>
+      <w:numFmt w:val="bullet"/>
+      <w:lvlText w:val=""/>
+      <w:lvlJc w:val="left"/>
+      <w:pPr>
+        <w:ind w:left="720" w:hanging="360"/>
+      </w:pPr>
+      <w:rPr>
+        <w:rFonts w:ascii="Wingdings" w:hAnsi="Wingdings" w:hint="default"/>
+      </w:rPr>
+    </w:lvl>
+    <w:lvl w:ilvl="1" w:tplc="40090003" w:tentative="1">
+      <w:start w:val="1"/>
+      <w:numFmt w:val="bullet"/>
+      <w:lvlText w:val="o"/>
+      <w:lvlJc w:val="left"/>
+      <w:pPr>
+        <w:ind w:left="1440" w:hanging="360"/>
+      </w:pPr>
+      <w:rPr>
+        <w:rFonts w:ascii="Courier New" w:hAnsi="Courier New" w:cs="Courier New" w:hint="default"/>
+      </w:rPr>
+    </w:lvl>
+    <w:lvl w:ilvl="2" w:tplc="40090005">
+      <w:start w:val="1"/>
+      <w:numFmt w:val="bullet"/>
+      <w:lvlText w:val=""/>
+      <w:lvlJc w:val="left"/>
+      <w:pPr>
+        <w:ind w:left="2160" w:hanging="360"/>
+      </w:pPr>
+      <w:rPr>
+        <w:rFonts w:ascii="Wingdings" w:hAnsi="Wingdings" w:hint="default"/>
+      </w:rPr>
+    </w:lvl>
+    <w:lvl w:ilvl="3" w:tplc="40090001" w:tentative="1">
+      <w:start w:val="1"/>
+      <w:numFmt w:val="bullet"/>
+      <w:lvlText w:val=""/>
+      <w:lvlJc w:val="left"/>
+      <w:pPr>
+        <w:ind w:left="2880" w:hanging="360"/>
+      </w:pPr>
+      <w:rPr>
+        <w:rFonts w:ascii="Symbol" w:hAnsi="Symbol" w:hint="default"/>
+      </w:rPr>
+    </w:lvl>
+    <w:lvl w:ilvl="4" w:tplc="40090003" w:tentative="1">
+      <w:start w:val="1"/>
+      <w:numFmt w:val="bullet"/>
+      <w:lvlText w:val="o"/>
+      <w:lvlJc w:val="left"/>
+      <w:pPr>
+        <w:ind w:left="3600" w:hanging="360"/>
+      </w:pPr>
+      <w:rPr>
+        <w:rFonts w:ascii="Courier New" w:hAnsi="Courier New" w:cs="Courier New" w:hint="default"/>
+      </w:rPr>
+    </w:lvl>
+    <w:lvl w:ilvl="5" w:tplc="40090005" w:tentative="1">
+      <w:start w:val="1"/>
+      <w:numFmt w:val="bullet"/>
+      <w:lvlText w:val=""/>
+      <w:lvlJc w:val="left"/>
+      <w:pPr>
+        <w:ind w:left="4320" w:hanging="360"/>
+      </w:pPr>
+      <w:rPr>
+        <w:rFonts w:ascii="Wingdings" w:hAnsi="Wingdings" w:hint="default"/>
+      </w:rPr>
+    </w:lvl>
+    <w:lvl w:ilvl="6" w:tplc="40090001" w:tentative="1">
+      <w:start w:val="1"/>
+      <w:numFmt w:val="bullet"/>
+      <w:lvlText w:val=""/>
+      <w:lvlJc w:val="left"/>
+      <w:pPr>
+        <w:ind w:left="5040" w:hanging="360"/>
+      </w:pPr>
+      <w:rPr>
+        <w:rFonts w:ascii="Symbol" w:hAnsi="Symbol" w:hint="default"/>
+      </w:rPr>
+    </w:lvl>
+    <w:lvl w:ilvl="7" w:tplc="40090003" w:tentative="1">
+      <w:start w:val="1"/>
+      <w:numFmt w:val="bullet"/>
+      <w:lvlText w:val="o"/>
+      <w:lvlJc w:val="left"/>
+      <w:pPr>
+        <w:ind w:left="5760" w:hanging="360"/>
+      </w:pPr>
+      <w:rPr>
+        <w:rFonts w:ascii="Courier New" w:hAnsi="Courier New" w:cs="Courier New" w:hint="default"/>
+      </w:rPr>
+    </w:lvl>
+    <w:lvl w:ilvl="8" w:tplc="40090005" w:tentative="1">
+      <w:start w:val="1"/>
+      <w:numFmt w:val="bullet"/>
+      <w:lvlText w:val=""/>
+      <w:lvlJc w:val="left"/>
+      <w:pPr>
+        <w:ind w:left="6480" w:hanging="360"/>
+      </w:pPr>
+      <w:rPr>
+        <w:rFonts w:ascii="Wingdings" w:hAnsi="Wingdings" w:hint="default"/>
+      </w:rPr>
+    </w:lvl>
+  </w:abstractNum>
+  <w:abstractNum w:abstractNumId="13" w15:restartNumberingAfterBreak="0">
     <w:nsid w:val="77280502"/>
     <w:multiLevelType w:val="multilevel"/>
     <w:tmpl w:val="8CBEFB58"/>
@@ -3927,34 +4484,46 @@
     </w:lvl>
   </w:abstractNum>
   <w:num w:numId="1" w16cid:durableId="1104224043">
+    <w:abstractNumId w:val="11"/>
+  </w:num>
+  <w:num w:numId="2" w16cid:durableId="102311422">
+    <w:abstractNumId w:val="9"/>
+  </w:num>
+  <w:num w:numId="3" w16cid:durableId="40982199">
+    <w:abstractNumId w:val="7"/>
+  </w:num>
+  <w:num w:numId="4" w16cid:durableId="1974214635">
+    <w:abstractNumId w:val="13"/>
+  </w:num>
+  <w:num w:numId="5" w16cid:durableId="1032076092">
+    <w:abstractNumId w:val="6"/>
+  </w:num>
+  <w:num w:numId="6" w16cid:durableId="117651708">
+    <w:abstractNumId w:val="5"/>
+  </w:num>
+  <w:num w:numId="7" w16cid:durableId="1076823469">
     <w:abstractNumId w:val="8"/>
   </w:num>
-  <w:num w:numId="2" w16cid:durableId="102311422">
-    <w:abstractNumId w:val="6"/>
+  <w:num w:numId="8" w16cid:durableId="584656264">
+    <w:abstractNumId w:val="10"/>
   </w:num>
-  <w:num w:numId="3" w16cid:durableId="40982199">
+  <w:num w:numId="9" w16cid:durableId="1313948396">
+    <w:abstractNumId w:val="3"/>
+  </w:num>
+  <w:num w:numId="10" w16cid:durableId="1386177793">
     <w:abstractNumId w:val="4"/>
   </w:num>
-  <w:num w:numId="4" w16cid:durableId="1974214635">
-    <w:abstractNumId w:val="9"/>
+  <w:num w:numId="11" w16cid:durableId="1437601332">
+    <w:abstractNumId w:val="1"/>
   </w:num>
-  <w:num w:numId="5" w16cid:durableId="1032076092">
-    <w:abstractNumId w:val="3"/>
+  <w:num w:numId="12" w16cid:durableId="166556095">
+    <w:abstractNumId w:val="12"/>
   </w:num>
-  <w:num w:numId="6" w16cid:durableId="117651708">
+  <w:num w:numId="13" w16cid:durableId="55595393">
     <w:abstractNumId w:val="2"/>
   </w:num>
-  <w:num w:numId="7" w16cid:durableId="1076823469">
-    <w:abstractNumId w:val="5"/>
-  </w:num>
-  <w:num w:numId="8" w16cid:durableId="584656264">
-    <w:abstractNumId w:val="7"/>
-  </w:num>
-  <w:num w:numId="9" w16cid:durableId="1313948396">
+  <w:num w:numId="14" w16cid:durableId="1614441922">
     <w:abstractNumId w:val="0"/>
-  </w:num>
-  <w:num w:numId="10" w16cid:durableId="1386177793">
-    <w:abstractNumId w:val="1"/>
   </w:num>
 </w:numbering>
 </file>

</xml_diff>

<commit_message>
Add GitHub repository link to Microfrontend App HLD document
</commit_message>
<xml_diff>
--- a/Microfrontend App HLD.docx
+++ b/Microfrontend App HLD.docx
@@ -2313,16 +2313,7 @@
           <w:bCs/>
           <w:lang w:val="en-IN"/>
         </w:rPr>
-        <w:t>Users</w:t>
-      </w:r>
-      <w:r>
-        <w:rPr>
-          <w:rFonts w:ascii="Calibri" w:hAnsi="Calibri" w:cs="Calibri"/>
-          <w:b/>
-          <w:bCs/>
-          <w:lang w:val="en-IN"/>
-        </w:rPr>
-        <w:t xml:space="preserve"> micro-frontend: </w:t>
+        <w:t xml:space="preserve">Users micro-frontend: </w:t>
       </w:r>
       <w:hyperlink r:id="rId8" w:history="1">
         <w:r>
@@ -2398,7 +2389,75 @@
       <w:pPr>
         <w:rPr>
           <w:rFonts w:ascii="Calibri" w:hAnsi="Calibri" w:cs="Calibri"/>
-          <w:lang w:val="pt-PT"/>
+          <w:b/>
+          <w:bCs/>
+          <w:lang w:val="en-IN"/>
+        </w:rPr>
+      </w:pPr>
+      <w:r>
+        <w:rPr>
+          <w:rFonts w:ascii="Calibri" w:hAnsi="Calibri" w:cs="Calibri"/>
+          <w:b/>
+          <w:bCs/>
+          <w:lang w:val="en-IN"/>
+        </w:rPr>
+        <w:t xml:space="preserve">9. </w:t>
+      </w:r>
+      <w:r>
+        <w:rPr>
+          <w:rFonts w:ascii="Calibri" w:hAnsi="Calibri" w:cs="Calibri"/>
+          <w:b/>
+          <w:bCs/>
+          <w:lang w:val="en-IN"/>
+        </w:rPr>
+        <w:t>GitHub Repository</w:t>
+      </w:r>
+    </w:p>
+    <w:p>
+      <w:pPr>
+        <w:pStyle w:val="ListParagraph"/>
+        <w:rPr>
+          <w:rFonts w:ascii="Calibri" w:hAnsi="Calibri" w:cs="Calibri"/>
+          <w:b/>
+          <w:bCs/>
+          <w:lang w:val="en-IN"/>
+        </w:rPr>
+      </w:pPr>
+    </w:p>
+    <w:p>
+      <w:pPr>
+        <w:rPr>
+          <w:rFonts w:ascii="Calibri" w:hAnsi="Calibri" w:cs="Calibri"/>
+          <w:lang w:val="en-IN"/>
+        </w:rPr>
+      </w:pPr>
+      <w:hyperlink r:id="rId10" w:history="1">
+        <w:r>
+          <w:rPr>
+            <w:rStyle w:val="Hyperlink"/>
+            <w:rFonts w:ascii="Calibri" w:hAnsi="Calibri" w:cs="Calibri"/>
+            <w:lang w:val="en-IN"/>
+          </w:rPr>
+          <w:t>https://github.com/gargaekansh/nagp_client_side_architecture_insurance_app-</w:t>
+        </w:r>
+      </w:hyperlink>
+    </w:p>
+    <w:p>
+      <w:pPr>
+        <w:ind w:left="360"/>
+        <w:rPr>
+          <w:rFonts w:ascii="Calibri" w:hAnsi="Calibri" w:cs="Calibri"/>
+          <w:b/>
+          <w:bCs/>
+          <w:lang w:val="en-IN"/>
+        </w:rPr>
+      </w:pPr>
+    </w:p>
+    <w:p>
+      <w:pPr>
+        <w:rPr>
+          <w:rFonts w:ascii="Calibri" w:hAnsi="Calibri" w:cs="Calibri"/>
+          <w:lang w:val="en-IN"/>
         </w:rPr>
       </w:pPr>
     </w:p>
@@ -5131,6 +5190,7 @@
   <w:style w:type="character" w:default="1" w:styleId="DefaultParagraphFont">
     <w:name w:val="Default Paragraph Font"/>
     <w:uiPriority w:val="1"/>
+    <w:semiHidden/>
     <w:unhideWhenUsed/>
   </w:style>
   <w:style w:type="table" w:default="1" w:styleId="TableNormal">

</xml_diff>